<commit_message>
area de firmas de ot de IN agrandado
</commit_message>
<xml_diff>
--- a/public/templates/template_instalaciones.docx
+++ b/public/templates/template_instalaciones.docx
@@ -1811,15 +1811,15 @@
         <w:ind w:right="551" w:firstLine="0"/>
         <w:jc w:val="both"/>
         <w:rPr>
-          <w:sz w:val="20"/>
-          <w:szCs w:val="20"/>
+          <w:sz w:val="19"/>
+          <w:szCs w:val="19"/>
         </w:rPr>
       </w:pPr>
       <w:r>
         <w:rPr>
           <w:w w:val="105"/>
-          <w:sz w:val="20"/>
-          <w:szCs w:val="20"/>
+          <w:sz w:val="19"/>
+          <w:szCs w:val="19"/>
         </w:rPr>
         <w:t>Incluye</w:t>
       </w:r>
@@ -1827,16 +1827,16 @@
         <w:rPr>
           <w:spacing w:val="-5"/>
           <w:w w:val="105"/>
-          <w:sz w:val="20"/>
-          <w:szCs w:val="20"/>
-        </w:rPr>
-        <w:t xml:space="preserve"> </w:t>
-      </w:r>
-      <w:r>
-        <w:rPr>
-          <w:w w:val="105"/>
-          <w:sz w:val="20"/>
-          <w:szCs w:val="20"/>
+          <w:sz w:val="19"/>
+          <w:szCs w:val="19"/>
+        </w:rPr>
+        <w:t xml:space="preserve"> </w:t>
+      </w:r>
+      <w:r>
+        <w:rPr>
+          <w:w w:val="105"/>
+          <w:sz w:val="19"/>
+          <w:szCs w:val="19"/>
         </w:rPr>
         <w:t>actas</w:t>
       </w:r>
@@ -1844,8 +1844,8 @@
         <w:rPr>
           <w:spacing w:val="-5"/>
           <w:w w:val="105"/>
-          <w:sz w:val="20"/>
-          <w:szCs w:val="20"/>
+          <w:sz w:val="19"/>
+          <w:szCs w:val="19"/>
         </w:rPr>
         <w:t xml:space="preserve"> </w:t>
       </w:r>
@@ -1853,16 +1853,16 @@
         <w:rPr>
           <w:spacing w:val="-5"/>
           <w:w w:val="105"/>
-          <w:sz w:val="20"/>
-          <w:szCs w:val="20"/>
+          <w:sz w:val="19"/>
+          <w:szCs w:val="19"/>
         </w:rPr>
         <w:t xml:space="preserve">físicas </w:t>
       </w:r>
       <w:r>
         <w:rPr>
           <w:w w:val="105"/>
-          <w:sz w:val="20"/>
-          <w:szCs w:val="20"/>
+          <w:sz w:val="19"/>
+          <w:szCs w:val="19"/>
         </w:rPr>
         <w:t>correctamente</w:t>
       </w:r>
@@ -1870,16 +1870,16 @@
         <w:rPr>
           <w:spacing w:val="-5"/>
           <w:w w:val="105"/>
-          <w:sz w:val="20"/>
-          <w:szCs w:val="20"/>
-        </w:rPr>
-        <w:t xml:space="preserve"> </w:t>
-      </w:r>
-      <w:r>
-        <w:rPr>
-          <w:w w:val="105"/>
-          <w:sz w:val="20"/>
-          <w:szCs w:val="20"/>
+          <w:sz w:val="19"/>
+          <w:szCs w:val="19"/>
+        </w:rPr>
+        <w:t xml:space="preserve"> </w:t>
+      </w:r>
+      <w:r>
+        <w:rPr>
+          <w:w w:val="105"/>
+          <w:sz w:val="19"/>
+          <w:szCs w:val="19"/>
         </w:rPr>
         <w:t>llenados</w:t>
       </w:r>
@@ -1887,32 +1887,32 @@
         <w:rPr>
           <w:spacing w:val="-5"/>
           <w:w w:val="105"/>
-          <w:sz w:val="20"/>
-          <w:szCs w:val="20"/>
-        </w:rPr>
-        <w:t xml:space="preserve"> </w:t>
-      </w:r>
-      <w:r>
-        <w:rPr>
-          <w:w w:val="105"/>
-          <w:sz w:val="20"/>
-          <w:szCs w:val="20"/>
+          <w:sz w:val="19"/>
+          <w:szCs w:val="19"/>
+        </w:rPr>
+        <w:t xml:space="preserve"> </w:t>
+      </w:r>
+      <w:r>
+        <w:rPr>
+          <w:w w:val="105"/>
+          <w:sz w:val="19"/>
+          <w:szCs w:val="19"/>
         </w:rPr>
         <w:t>y</w:t>
       </w:r>
       <w:r>
         <w:rPr>
           <w:w w:val="105"/>
-          <w:sz w:val="20"/>
-          <w:szCs w:val="20"/>
+          <w:sz w:val="19"/>
+          <w:szCs w:val="19"/>
         </w:rPr>
         <w:t xml:space="preserve"> en formatos </w:t>
       </w:r>
       <w:r>
         <w:rPr>
           <w:w w:val="105"/>
-          <w:sz w:val="20"/>
-          <w:szCs w:val="20"/>
+          <w:sz w:val="19"/>
+          <w:szCs w:val="19"/>
         </w:rPr>
         <w:t>establecidos</w:t>
       </w:r>
@@ -1920,8 +1920,8 @@
         <w:rPr>
           <w:spacing w:val="-6"/>
           <w:w w:val="105"/>
-          <w:sz w:val="20"/>
-          <w:szCs w:val="20"/>
+          <w:sz w:val="19"/>
+          <w:szCs w:val="19"/>
         </w:rPr>
         <w:t>.</w:t>
       </w:r>
@@ -1940,15 +1940,15 @@
         <w:ind w:right="392" w:firstLine="0"/>
         <w:jc w:val="both"/>
         <w:rPr>
-          <w:sz w:val="20"/>
-          <w:szCs w:val="20"/>
+          <w:sz w:val="19"/>
+          <w:szCs w:val="19"/>
         </w:rPr>
       </w:pPr>
       <w:r>
         <w:rPr>
           <w:w w:val="105"/>
-          <w:sz w:val="20"/>
-          <w:szCs w:val="20"/>
+          <w:sz w:val="19"/>
+          <w:szCs w:val="19"/>
         </w:rPr>
         <w:t>y</w:t>
       </w:r>
@@ -1956,16 +1956,16 @@
         <w:rPr>
           <w:spacing w:val="-7"/>
           <w:w w:val="105"/>
-          <w:sz w:val="20"/>
-          <w:szCs w:val="20"/>
-        </w:rPr>
-        <w:t xml:space="preserve"> </w:t>
-      </w:r>
-      <w:r>
-        <w:rPr>
-          <w:w w:val="105"/>
-          <w:sz w:val="20"/>
-          <w:szCs w:val="20"/>
+          <w:sz w:val="19"/>
+          <w:szCs w:val="19"/>
+        </w:rPr>
+        <w:t xml:space="preserve"> </w:t>
+      </w:r>
+      <w:r>
+        <w:rPr>
+          <w:w w:val="105"/>
+          <w:sz w:val="19"/>
+          <w:szCs w:val="19"/>
         </w:rPr>
         <w:t>(3)</w:t>
       </w:r>
@@ -1973,16 +1973,16 @@
         <w:rPr>
           <w:spacing w:val="-5"/>
           <w:w w:val="105"/>
-          <w:sz w:val="20"/>
-          <w:szCs w:val="20"/>
-        </w:rPr>
-        <w:t xml:space="preserve"> </w:t>
-      </w:r>
-      <w:r>
-        <w:rPr>
-          <w:w w:val="105"/>
-          <w:sz w:val="20"/>
-          <w:szCs w:val="20"/>
+          <w:sz w:val="19"/>
+          <w:szCs w:val="19"/>
+        </w:rPr>
+        <w:t xml:space="preserve"> </w:t>
+      </w:r>
+      <w:r>
+        <w:rPr>
+          <w:w w:val="105"/>
+          <w:sz w:val="19"/>
+          <w:szCs w:val="19"/>
         </w:rPr>
         <w:t>Reporte</w:t>
       </w:r>
@@ -1990,51 +1990,42 @@
         <w:rPr>
           <w:spacing w:val="-6"/>
           <w:w w:val="105"/>
-          <w:sz w:val="20"/>
-          <w:szCs w:val="20"/>
-        </w:rPr>
-        <w:t xml:space="preserve"> </w:t>
+          <w:sz w:val="19"/>
+          <w:szCs w:val="19"/>
+        </w:rPr>
+        <w:t xml:space="preserve"> de</w:t>
       </w:r>
       <w:r>
         <w:rPr>
           <w:spacing w:val="-6"/>
           <w:w w:val="105"/>
-          <w:sz w:val="20"/>
-          <w:szCs w:val="20"/>
+          <w:sz w:val="19"/>
+          <w:szCs w:val="19"/>
+        </w:rPr>
+        <w:t xml:space="preserve"> ejecución </w:t>
+      </w:r>
+      <w:r>
+        <w:rPr>
+          <w:w w:val="105"/>
+          <w:sz w:val="19"/>
+          <w:szCs w:val="19"/>
         </w:rPr>
         <w:t>de</w:t>
       </w:r>
       <w:r>
         <w:rPr>
-          <w:spacing w:val="-6"/>
-          <w:w w:val="105"/>
-          <w:sz w:val="20"/>
-          <w:szCs w:val="20"/>
-        </w:rPr>
-        <w:t xml:space="preserve"> ejecución </w:t>
-      </w:r>
-      <w:r>
-        <w:rPr>
-          <w:w w:val="105"/>
-          <w:sz w:val="20"/>
-          <w:szCs w:val="20"/>
-        </w:rPr>
-        <w:t>de</w:t>
-      </w:r>
-      <w:r>
-        <w:rPr>
           <w:spacing w:val="-5"/>
           <w:w w:val="105"/>
-          <w:sz w:val="20"/>
-          <w:szCs w:val="20"/>
-        </w:rPr>
-        <w:t xml:space="preserve"> </w:t>
-      </w:r>
-      <w:r>
-        <w:rPr>
-          <w:w w:val="105"/>
-          <w:sz w:val="20"/>
-          <w:szCs w:val="20"/>
+          <w:sz w:val="19"/>
+          <w:szCs w:val="19"/>
+        </w:rPr>
+        <w:t xml:space="preserve"> </w:t>
+      </w:r>
+      <w:r>
+        <w:rPr>
+          <w:w w:val="105"/>
+          <w:sz w:val="19"/>
+          <w:szCs w:val="19"/>
         </w:rPr>
         <w:t>trabajos</w:t>
       </w:r>
@@ -2042,34 +2033,25 @@
         <w:rPr>
           <w:spacing w:val="-5"/>
           <w:w w:val="105"/>
-          <w:sz w:val="20"/>
-          <w:szCs w:val="20"/>
-        </w:rPr>
-        <w:t xml:space="preserve"> </w:t>
+          <w:sz w:val="19"/>
+          <w:szCs w:val="19"/>
+        </w:rPr>
+        <w:t xml:space="preserve"> con</w:t>
       </w:r>
       <w:r>
         <w:rPr>
           <w:spacing w:val="-5"/>
           <w:w w:val="105"/>
-          <w:sz w:val="20"/>
-          <w:szCs w:val="20"/>
-        </w:rPr>
-        <w:t>con</w:t>
-      </w:r>
-      <w:r>
-        <w:rPr>
-          <w:spacing w:val="-5"/>
-          <w:w w:val="105"/>
-          <w:sz w:val="20"/>
-          <w:szCs w:val="20"/>
+          <w:sz w:val="19"/>
+          <w:szCs w:val="19"/>
         </w:rPr>
         <w:t xml:space="preserve"> 6 fotografías debidamente fechadas, subir escaneo y fotos al SIELSE</w:t>
       </w:r>
       <w:r>
         <w:rPr>
           <w:w w:val="105"/>
-          <w:sz w:val="20"/>
-          <w:szCs w:val="20"/>
+          <w:sz w:val="19"/>
+          <w:szCs w:val="19"/>
         </w:rPr>
         <w:t>.</w:t>
       </w:r>
@@ -2087,15 +2069,15 @@
         <w:ind w:left="345" w:hanging="252"/>
         <w:jc w:val="both"/>
         <w:rPr>
-          <w:sz w:val="20"/>
-          <w:szCs w:val="20"/>
+          <w:sz w:val="19"/>
+          <w:szCs w:val="19"/>
         </w:rPr>
       </w:pPr>
       <w:r>
         <w:rPr>
           <w:w w:val="105"/>
-          <w:sz w:val="20"/>
-          <w:szCs w:val="20"/>
+          <w:sz w:val="19"/>
+          <w:szCs w:val="19"/>
         </w:rPr>
         <w:t>Realizar</w:t>
       </w:r>
@@ -2103,16 +2085,16 @@
         <w:rPr>
           <w:spacing w:val="-8"/>
           <w:w w:val="105"/>
-          <w:sz w:val="20"/>
-          <w:szCs w:val="20"/>
-        </w:rPr>
-        <w:t xml:space="preserve"> </w:t>
-      </w:r>
-      <w:r>
-        <w:rPr>
-          <w:w w:val="105"/>
-          <w:sz w:val="20"/>
-          <w:szCs w:val="20"/>
+          <w:sz w:val="19"/>
+          <w:szCs w:val="19"/>
+        </w:rPr>
+        <w:t xml:space="preserve"> </w:t>
+      </w:r>
+      <w:r>
+        <w:rPr>
+          <w:w w:val="105"/>
+          <w:sz w:val="19"/>
+          <w:szCs w:val="19"/>
         </w:rPr>
         <w:t>los</w:t>
       </w:r>
@@ -2120,16 +2102,16 @@
         <w:rPr>
           <w:spacing w:val="-7"/>
           <w:w w:val="105"/>
-          <w:sz w:val="20"/>
-          <w:szCs w:val="20"/>
-        </w:rPr>
-        <w:t xml:space="preserve"> </w:t>
-      </w:r>
-      <w:r>
-        <w:rPr>
-          <w:w w:val="105"/>
-          <w:sz w:val="20"/>
-          <w:szCs w:val="20"/>
+          <w:sz w:val="19"/>
+          <w:szCs w:val="19"/>
+        </w:rPr>
+        <w:t xml:space="preserve"> </w:t>
+      </w:r>
+      <w:r>
+        <w:rPr>
+          <w:w w:val="105"/>
+          <w:sz w:val="19"/>
+          <w:szCs w:val="19"/>
         </w:rPr>
         <w:t>trabajos</w:t>
       </w:r>
@@ -2137,8 +2119,8 @@
         <w:rPr>
           <w:spacing w:val="-6"/>
           <w:w w:val="105"/>
-          <w:sz w:val="20"/>
-          <w:szCs w:val="20"/>
+          <w:sz w:val="19"/>
+          <w:szCs w:val="19"/>
         </w:rPr>
         <w:t xml:space="preserve"> programados como máximo en los plazos establecidos bajo responsabilidad y pasible de penalidades en caso de incumplimiento.</w:t>
       </w:r>
@@ -2157,14 +2139,14 @@
         <w:ind w:left="93" w:right="732" w:firstLine="0"/>
         <w:jc w:val="both"/>
         <w:rPr>
-          <w:sz w:val="20"/>
-          <w:szCs w:val="20"/>
+          <w:sz w:val="19"/>
+          <w:szCs w:val="19"/>
         </w:rPr>
       </w:pPr>
       <w:r>
         <w:rPr>
-          <w:sz w:val="20"/>
-          <w:szCs w:val="20"/>
+          <w:sz w:val="19"/>
+          <w:szCs w:val="19"/>
         </w:rPr>
         <w:t xml:space="preserve">Enviado por correo electrónico. Las </w:t>
       </w:r>
@@ -2174,15 +2156,15 @@
           <w:bCs/>
           <w:i/>
           <w:iCs/>
-          <w:sz w:val="20"/>
-          <w:szCs w:val="20"/>
+          <w:sz w:val="19"/>
+          <w:szCs w:val="19"/>
         </w:rPr>
         <w:t>factibilidades</w:t>
       </w:r>
       <w:r>
         <w:rPr>
-          <w:sz w:val="20"/>
-          <w:szCs w:val="20"/>
+          <w:sz w:val="19"/>
+          <w:szCs w:val="19"/>
         </w:rPr>
         <w:t xml:space="preserve"> serán realizadas en una sola visita caso contrario se entenderá que no están comunicando al usuario correctamente.  </w:t>
       </w:r>
@@ -2192,15 +2174,15 @@
           <w:bCs/>
           <w:i/>
           <w:iCs/>
-          <w:sz w:val="20"/>
-          <w:szCs w:val="20"/>
+          <w:sz w:val="19"/>
+          <w:szCs w:val="19"/>
         </w:rPr>
         <w:t>Instalaciones Nuevas</w:t>
       </w:r>
       <w:r>
         <w:rPr>
-          <w:sz w:val="20"/>
-          <w:szCs w:val="20"/>
+          <w:sz w:val="19"/>
+          <w:szCs w:val="19"/>
         </w:rPr>
         <w:t xml:space="preserve"> coordinar con los usuarios. </w:t>
       </w:r>
@@ -2219,15 +2201,15 @@
         <w:ind w:left="93" w:right="577" w:firstLine="0"/>
         <w:jc w:val="both"/>
         <w:rPr>
-          <w:sz w:val="20"/>
-          <w:szCs w:val="20"/>
+          <w:sz w:val="19"/>
+          <w:szCs w:val="19"/>
         </w:rPr>
       </w:pPr>
       <w:r>
         <w:rPr>
           <w:w w:val="105"/>
-          <w:sz w:val="20"/>
-          <w:szCs w:val="20"/>
+          <w:sz w:val="19"/>
+          <w:szCs w:val="19"/>
         </w:rPr>
         <w:t>Cumplir</w:t>
       </w:r>
@@ -2235,16 +2217,16 @@
         <w:rPr>
           <w:spacing w:val="-7"/>
           <w:w w:val="105"/>
-          <w:sz w:val="20"/>
-          <w:szCs w:val="20"/>
-        </w:rPr>
-        <w:t xml:space="preserve"> </w:t>
-      </w:r>
-      <w:r>
-        <w:rPr>
-          <w:w w:val="105"/>
-          <w:sz w:val="20"/>
-          <w:szCs w:val="20"/>
+          <w:sz w:val="19"/>
+          <w:szCs w:val="19"/>
+        </w:rPr>
+        <w:t xml:space="preserve"> </w:t>
+      </w:r>
+      <w:r>
+        <w:rPr>
+          <w:w w:val="105"/>
+          <w:sz w:val="19"/>
+          <w:szCs w:val="19"/>
         </w:rPr>
         <w:t>en</w:t>
       </w:r>
@@ -2252,16 +2234,16 @@
         <w:rPr>
           <w:spacing w:val="-7"/>
           <w:w w:val="105"/>
-          <w:sz w:val="20"/>
-          <w:szCs w:val="20"/>
-        </w:rPr>
-        <w:t xml:space="preserve"> </w:t>
-      </w:r>
-      <w:r>
-        <w:rPr>
-          <w:w w:val="105"/>
-          <w:sz w:val="20"/>
-          <w:szCs w:val="20"/>
+          <w:sz w:val="19"/>
+          <w:szCs w:val="19"/>
+        </w:rPr>
+        <w:t xml:space="preserve"> </w:t>
+      </w:r>
+      <w:r>
+        <w:rPr>
+          <w:w w:val="105"/>
+          <w:sz w:val="19"/>
+          <w:szCs w:val="19"/>
         </w:rPr>
         <w:t>su</w:t>
       </w:r>
@@ -2269,16 +2251,16 @@
         <w:rPr>
           <w:spacing w:val="-7"/>
           <w:w w:val="105"/>
-          <w:sz w:val="20"/>
-          <w:szCs w:val="20"/>
-        </w:rPr>
-        <w:t xml:space="preserve"> </w:t>
-      </w:r>
-      <w:r>
-        <w:rPr>
-          <w:w w:val="105"/>
-          <w:sz w:val="20"/>
-          <w:szCs w:val="20"/>
+          <w:sz w:val="19"/>
+          <w:szCs w:val="19"/>
+        </w:rPr>
+        <w:t xml:space="preserve"> </w:t>
+      </w:r>
+      <w:r>
+        <w:rPr>
+          <w:w w:val="105"/>
+          <w:sz w:val="19"/>
+          <w:szCs w:val="19"/>
         </w:rPr>
         <w:t>totalidad</w:t>
       </w:r>
@@ -2286,16 +2268,16 @@
         <w:rPr>
           <w:spacing w:val="-8"/>
           <w:w w:val="105"/>
-          <w:sz w:val="20"/>
-          <w:szCs w:val="20"/>
-        </w:rPr>
-        <w:t xml:space="preserve"> </w:t>
-      </w:r>
-      <w:r>
-        <w:rPr>
-          <w:w w:val="105"/>
-          <w:sz w:val="20"/>
-          <w:szCs w:val="20"/>
+          <w:sz w:val="19"/>
+          <w:szCs w:val="19"/>
+        </w:rPr>
+        <w:t xml:space="preserve"> </w:t>
+      </w:r>
+      <w:r>
+        <w:rPr>
+          <w:w w:val="105"/>
+          <w:sz w:val="19"/>
+          <w:szCs w:val="19"/>
         </w:rPr>
         <w:t>las</w:t>
       </w:r>
@@ -2303,16 +2285,16 @@
         <w:rPr>
           <w:spacing w:val="-6"/>
           <w:w w:val="105"/>
-          <w:sz w:val="20"/>
-          <w:szCs w:val="20"/>
-        </w:rPr>
-        <w:t xml:space="preserve"> </w:t>
-      </w:r>
-      <w:r>
-        <w:rPr>
-          <w:w w:val="105"/>
-          <w:sz w:val="20"/>
-          <w:szCs w:val="20"/>
+          <w:sz w:val="19"/>
+          <w:szCs w:val="19"/>
+        </w:rPr>
+        <w:t xml:space="preserve"> </w:t>
+      </w:r>
+      <w:r>
+        <w:rPr>
+          <w:w w:val="105"/>
+          <w:sz w:val="19"/>
+          <w:szCs w:val="19"/>
         </w:rPr>
         <w:t>actividades</w:t>
       </w:r>
@@ -2320,16 +2302,16 @@
         <w:rPr>
           <w:spacing w:val="-6"/>
           <w:w w:val="105"/>
-          <w:sz w:val="20"/>
-          <w:szCs w:val="20"/>
-        </w:rPr>
-        <w:t xml:space="preserve"> </w:t>
-      </w:r>
-      <w:r>
-        <w:rPr>
-          <w:w w:val="105"/>
-          <w:sz w:val="20"/>
-          <w:szCs w:val="20"/>
+          <w:sz w:val="19"/>
+          <w:szCs w:val="19"/>
+        </w:rPr>
+        <w:t xml:space="preserve"> </w:t>
+      </w:r>
+      <w:r>
+        <w:rPr>
+          <w:w w:val="105"/>
+          <w:sz w:val="19"/>
+          <w:szCs w:val="19"/>
         </w:rPr>
         <w:t>programadas</w:t>
       </w:r>
@@ -2337,16 +2319,16 @@
         <w:rPr>
           <w:spacing w:val="-6"/>
           <w:w w:val="105"/>
-          <w:sz w:val="20"/>
-          <w:szCs w:val="20"/>
-        </w:rPr>
-        <w:t xml:space="preserve"> </w:t>
-      </w:r>
-      <w:r>
-        <w:rPr>
-          <w:w w:val="105"/>
-          <w:sz w:val="20"/>
-          <w:szCs w:val="20"/>
+          <w:sz w:val="19"/>
+          <w:szCs w:val="19"/>
+        </w:rPr>
+        <w:t xml:space="preserve"> </w:t>
+      </w:r>
+      <w:r>
+        <w:rPr>
+          <w:w w:val="105"/>
+          <w:sz w:val="19"/>
+          <w:szCs w:val="19"/>
         </w:rPr>
         <w:t>para</w:t>
       </w:r>
@@ -2354,8 +2336,8 @@
         <w:rPr>
           <w:spacing w:val="-5"/>
           <w:w w:val="105"/>
-          <w:sz w:val="20"/>
-          <w:szCs w:val="20"/>
+          <w:sz w:val="19"/>
+          <w:szCs w:val="19"/>
         </w:rPr>
         <w:t xml:space="preserve"> </w:t>
       </w:r>
@@ -2363,8 +2345,8 @@
         <w:rPr>
           <w:b/>
           <w:w w:val="105"/>
-          <w:sz w:val="20"/>
-          <w:szCs w:val="20"/>
+          <w:sz w:val="19"/>
+          <w:szCs w:val="19"/>
         </w:rPr>
         <w:t>evitar</w:t>
       </w:r>
@@ -2373,8 +2355,8 @@
           <w:b/>
           <w:spacing w:val="-7"/>
           <w:w w:val="105"/>
-          <w:sz w:val="20"/>
-          <w:szCs w:val="20"/>
+          <w:sz w:val="19"/>
+          <w:szCs w:val="19"/>
         </w:rPr>
         <w:t xml:space="preserve"> </w:t>
       </w:r>
@@ -2382,8 +2364,8 @@
         <w:rPr>
           <w:b/>
           <w:w w:val="105"/>
-          <w:sz w:val="20"/>
-          <w:szCs w:val="20"/>
+          <w:sz w:val="19"/>
+          <w:szCs w:val="19"/>
         </w:rPr>
         <w:t>RECLAMOS</w:t>
       </w:r>
@@ -2392,8 +2374,8 @@
           <w:b/>
           <w:spacing w:val="-7"/>
           <w:w w:val="105"/>
-          <w:sz w:val="20"/>
-          <w:szCs w:val="20"/>
+          <w:sz w:val="19"/>
+          <w:szCs w:val="19"/>
         </w:rPr>
         <w:t xml:space="preserve"> </w:t>
       </w:r>
@@ -2401,8 +2383,8 @@
         <w:rPr>
           <w:b/>
           <w:w w:val="105"/>
-          <w:sz w:val="20"/>
-          <w:szCs w:val="20"/>
+          <w:sz w:val="19"/>
+          <w:szCs w:val="19"/>
         </w:rPr>
         <w:t>DE</w:t>
       </w:r>
@@ -2411,8 +2393,8 @@
           <w:b/>
           <w:spacing w:val="-8"/>
           <w:w w:val="105"/>
-          <w:sz w:val="20"/>
-          <w:szCs w:val="20"/>
+          <w:sz w:val="19"/>
+          <w:szCs w:val="19"/>
         </w:rPr>
         <w:t xml:space="preserve"> </w:t>
       </w:r>
@@ -2420,8 +2402,8 @@
         <w:rPr>
           <w:b/>
           <w:w w:val="105"/>
-          <w:sz w:val="20"/>
-          <w:szCs w:val="20"/>
+          <w:sz w:val="19"/>
+          <w:szCs w:val="19"/>
         </w:rPr>
         <w:t>LOS</w:t>
       </w:r>
@@ -2430,8 +2412,8 @@
           <w:b/>
           <w:spacing w:val="-7"/>
           <w:w w:val="105"/>
-          <w:sz w:val="20"/>
-          <w:szCs w:val="20"/>
+          <w:sz w:val="19"/>
+          <w:szCs w:val="19"/>
         </w:rPr>
         <w:t xml:space="preserve"> </w:t>
       </w:r>
@@ -2439,16 +2421,16 @@
         <w:rPr>
           <w:b/>
           <w:w w:val="105"/>
-          <w:sz w:val="20"/>
-          <w:szCs w:val="20"/>
+          <w:sz w:val="19"/>
+          <w:szCs w:val="19"/>
         </w:rPr>
         <w:t>USUARIOS</w:t>
       </w:r>
       <w:r>
         <w:rPr>
           <w:w w:val="105"/>
-          <w:sz w:val="20"/>
-          <w:szCs w:val="20"/>
+          <w:sz w:val="19"/>
+          <w:szCs w:val="19"/>
         </w:rPr>
         <w:t>,</w:t>
       </w:r>
@@ -2456,16 +2438,16 @@
         <w:rPr>
           <w:spacing w:val="-8"/>
           <w:w w:val="105"/>
-          <w:sz w:val="20"/>
-          <w:szCs w:val="20"/>
-        </w:rPr>
-        <w:t xml:space="preserve"> </w:t>
-      </w:r>
-      <w:r>
-        <w:rPr>
-          <w:w w:val="105"/>
-          <w:sz w:val="20"/>
-          <w:szCs w:val="20"/>
+          <w:sz w:val="19"/>
+          <w:szCs w:val="19"/>
+        </w:rPr>
+        <w:t xml:space="preserve"> </w:t>
+      </w:r>
+      <w:r>
+        <w:rPr>
+          <w:w w:val="105"/>
+          <w:sz w:val="19"/>
+          <w:szCs w:val="19"/>
         </w:rPr>
         <w:t>casos</w:t>
       </w:r>
@@ -2473,16 +2455,16 @@
         <w:rPr>
           <w:spacing w:val="-6"/>
           <w:w w:val="105"/>
-          <w:sz w:val="20"/>
-          <w:szCs w:val="20"/>
-        </w:rPr>
-        <w:t xml:space="preserve"> </w:t>
-      </w:r>
-      <w:r>
-        <w:rPr>
-          <w:w w:val="105"/>
-          <w:sz w:val="20"/>
-          <w:szCs w:val="20"/>
+          <w:sz w:val="19"/>
+          <w:szCs w:val="19"/>
+        </w:rPr>
+        <w:t xml:space="preserve"> </w:t>
+      </w:r>
+      <w:r>
+        <w:rPr>
+          <w:w w:val="105"/>
+          <w:sz w:val="19"/>
+          <w:szCs w:val="19"/>
         </w:rPr>
         <w:t>excepcionales</w:t>
       </w:r>
@@ -2490,16 +2472,16 @@
         <w:rPr>
           <w:spacing w:val="-6"/>
           <w:w w:val="105"/>
-          <w:sz w:val="20"/>
-          <w:szCs w:val="20"/>
-        </w:rPr>
-        <w:t xml:space="preserve"> </w:t>
-      </w:r>
-      <w:r>
-        <w:rPr>
-          <w:w w:val="105"/>
-          <w:sz w:val="20"/>
-          <w:szCs w:val="20"/>
+          <w:sz w:val="19"/>
+          <w:szCs w:val="19"/>
+        </w:rPr>
+        <w:t xml:space="preserve"> </w:t>
+      </w:r>
+      <w:r>
+        <w:rPr>
+          <w:w w:val="105"/>
+          <w:sz w:val="19"/>
+          <w:szCs w:val="19"/>
         </w:rPr>
         <w:t>se</w:t>
       </w:r>
@@ -2507,16 +2489,16 @@
         <w:rPr>
           <w:spacing w:val="-7"/>
           <w:w w:val="105"/>
-          <w:sz w:val="20"/>
-          <w:szCs w:val="20"/>
-        </w:rPr>
-        <w:t xml:space="preserve"> </w:t>
-      </w:r>
-      <w:r>
-        <w:rPr>
-          <w:w w:val="105"/>
-          <w:sz w:val="20"/>
-          <w:szCs w:val="20"/>
+          <w:sz w:val="19"/>
+          <w:szCs w:val="19"/>
+        </w:rPr>
+        <w:t xml:space="preserve"> </w:t>
+      </w:r>
+      <w:r>
+        <w:rPr>
+          <w:w w:val="105"/>
+          <w:sz w:val="19"/>
+          <w:szCs w:val="19"/>
         </w:rPr>
         <w:t>reprogramará</w:t>
       </w:r>
@@ -2524,16 +2506,16 @@
         <w:rPr>
           <w:spacing w:val="-8"/>
           <w:w w:val="105"/>
-          <w:sz w:val="20"/>
-          <w:szCs w:val="20"/>
-        </w:rPr>
-        <w:t xml:space="preserve"> </w:t>
-      </w:r>
-      <w:r>
-        <w:rPr>
-          <w:w w:val="105"/>
-          <w:sz w:val="20"/>
-          <w:szCs w:val="20"/>
+          <w:sz w:val="19"/>
+          <w:szCs w:val="19"/>
+        </w:rPr>
+        <w:t xml:space="preserve"> </w:t>
+      </w:r>
+      <w:r>
+        <w:rPr>
+          <w:w w:val="105"/>
+          <w:sz w:val="19"/>
+          <w:szCs w:val="19"/>
         </w:rPr>
         <w:t>coordinando</w:t>
       </w:r>
@@ -2541,16 +2523,16 @@
         <w:rPr>
           <w:spacing w:val="-8"/>
           <w:w w:val="105"/>
-          <w:sz w:val="20"/>
-          <w:szCs w:val="20"/>
-        </w:rPr>
-        <w:t xml:space="preserve"> </w:t>
-      </w:r>
-      <w:r>
-        <w:rPr>
-          <w:w w:val="105"/>
-          <w:sz w:val="20"/>
-          <w:szCs w:val="20"/>
+          <w:sz w:val="19"/>
+          <w:szCs w:val="19"/>
+        </w:rPr>
+        <w:t xml:space="preserve"> </w:t>
+      </w:r>
+      <w:r>
+        <w:rPr>
+          <w:w w:val="105"/>
+          <w:sz w:val="19"/>
+          <w:szCs w:val="19"/>
         </w:rPr>
         <w:t>por</w:t>
       </w:r>
@@ -2558,16 +2540,16 @@
         <w:rPr>
           <w:spacing w:val="-7"/>
           <w:w w:val="105"/>
-          <w:sz w:val="20"/>
-          <w:szCs w:val="20"/>
-        </w:rPr>
-        <w:t xml:space="preserve"> </w:t>
-      </w:r>
-      <w:r>
-        <w:rPr>
-          <w:w w:val="105"/>
-          <w:sz w:val="20"/>
-          <w:szCs w:val="20"/>
+          <w:sz w:val="19"/>
+          <w:szCs w:val="19"/>
+        </w:rPr>
+        <w:t xml:space="preserve"> </w:t>
+      </w:r>
+      <w:r>
+        <w:rPr>
+          <w:w w:val="105"/>
+          <w:sz w:val="19"/>
+          <w:szCs w:val="19"/>
         </w:rPr>
         <w:t>celular</w:t>
       </w:r>
@@ -2575,16 +2557,16 @@
         <w:rPr>
           <w:spacing w:val="-8"/>
           <w:w w:val="105"/>
-          <w:sz w:val="20"/>
-          <w:szCs w:val="20"/>
-        </w:rPr>
-        <w:t xml:space="preserve"> </w:t>
-      </w:r>
-      <w:r>
-        <w:rPr>
-          <w:w w:val="105"/>
-          <w:sz w:val="20"/>
-          <w:szCs w:val="20"/>
+          <w:sz w:val="19"/>
+          <w:szCs w:val="19"/>
+        </w:rPr>
+        <w:t xml:space="preserve"> </w:t>
+      </w:r>
+      <w:r>
+        <w:rPr>
+          <w:w w:val="105"/>
+          <w:sz w:val="19"/>
+          <w:szCs w:val="19"/>
         </w:rPr>
         <w:t>con</w:t>
       </w:r>
@@ -2592,24 +2574,24 @@
         <w:rPr>
           <w:spacing w:val="-7"/>
           <w:w w:val="105"/>
-          <w:sz w:val="20"/>
-          <w:szCs w:val="20"/>
-        </w:rPr>
-        <w:t xml:space="preserve"> </w:t>
-      </w:r>
-      <w:r>
-        <w:rPr>
-          <w:w w:val="105"/>
-          <w:sz w:val="20"/>
-          <w:szCs w:val="20"/>
+          <w:sz w:val="19"/>
+          <w:szCs w:val="19"/>
+        </w:rPr>
+        <w:t xml:space="preserve"> </w:t>
+      </w:r>
+      <w:r>
+        <w:rPr>
+          <w:w w:val="105"/>
+          <w:sz w:val="19"/>
+          <w:szCs w:val="19"/>
         </w:rPr>
         <w:t>el usuario (Bajo responsabilidad) y todos deben estar debidamente firmados</w:t>
       </w:r>
       <w:r>
         <w:rPr>
           <w:w w:val="105"/>
-          <w:sz w:val="20"/>
-          <w:szCs w:val="20"/>
+          <w:sz w:val="19"/>
+          <w:szCs w:val="19"/>
         </w:rPr>
         <w:t>.</w:t>
       </w:r>
@@ -2628,15 +2610,15 @@
         <w:ind w:left="93" w:right="272" w:firstLine="0"/>
         <w:jc w:val="both"/>
         <w:rPr>
-          <w:sz w:val="20"/>
-          <w:szCs w:val="20"/>
+          <w:sz w:val="19"/>
+          <w:szCs w:val="19"/>
         </w:rPr>
       </w:pPr>
       <w:r>
         <w:rPr>
           <w:w w:val="105"/>
-          <w:sz w:val="20"/>
-          <w:szCs w:val="20"/>
+          <w:sz w:val="19"/>
+          <w:szCs w:val="19"/>
         </w:rPr>
         <w:t>Se</w:t>
       </w:r>
@@ -2644,16 +2626,16 @@
         <w:rPr>
           <w:spacing w:val="-5"/>
           <w:w w:val="105"/>
-          <w:sz w:val="20"/>
-          <w:szCs w:val="20"/>
-        </w:rPr>
-        <w:t xml:space="preserve"> </w:t>
-      </w:r>
-      <w:r>
-        <w:rPr>
-          <w:w w:val="105"/>
-          <w:sz w:val="20"/>
-          <w:szCs w:val="20"/>
+          <w:sz w:val="19"/>
+          <w:szCs w:val="19"/>
+        </w:rPr>
+        <w:t xml:space="preserve"> </w:t>
+      </w:r>
+      <w:r>
+        <w:rPr>
+          <w:w w:val="105"/>
+          <w:sz w:val="19"/>
+          <w:szCs w:val="19"/>
         </w:rPr>
         <w:t>realiza</w:t>
       </w:r>
@@ -2661,16 +2643,16 @@
         <w:rPr>
           <w:spacing w:val="-6"/>
           <w:w w:val="105"/>
-          <w:sz w:val="20"/>
-          <w:szCs w:val="20"/>
-        </w:rPr>
-        <w:t xml:space="preserve"> </w:t>
-      </w:r>
-      <w:r>
-        <w:rPr>
-          <w:w w:val="105"/>
-          <w:sz w:val="20"/>
-          <w:szCs w:val="20"/>
+          <w:sz w:val="19"/>
+          <w:szCs w:val="19"/>
+        </w:rPr>
+        <w:t xml:space="preserve"> </w:t>
+      </w:r>
+      <w:r>
+        <w:rPr>
+          <w:w w:val="105"/>
+          <w:sz w:val="19"/>
+          <w:szCs w:val="19"/>
         </w:rPr>
         <w:t>la</w:t>
       </w:r>
@@ -2678,16 +2660,16 @@
         <w:rPr>
           <w:spacing w:val="-6"/>
           <w:w w:val="105"/>
-          <w:sz w:val="20"/>
-          <w:szCs w:val="20"/>
-        </w:rPr>
-        <w:t xml:space="preserve"> </w:t>
-      </w:r>
-      <w:r>
-        <w:rPr>
-          <w:w w:val="105"/>
-          <w:sz w:val="20"/>
-          <w:szCs w:val="20"/>
+          <w:sz w:val="19"/>
+          <w:szCs w:val="19"/>
+        </w:rPr>
+        <w:t xml:space="preserve"> </w:t>
+      </w:r>
+      <w:r>
+        <w:rPr>
+          <w:w w:val="105"/>
+          <w:sz w:val="19"/>
+          <w:szCs w:val="19"/>
         </w:rPr>
         <w:t>entrega</w:t>
       </w:r>
@@ -2695,16 +2677,16 @@
         <w:rPr>
           <w:spacing w:val="-6"/>
           <w:w w:val="105"/>
-          <w:sz w:val="20"/>
-          <w:szCs w:val="20"/>
-        </w:rPr>
-        <w:t xml:space="preserve"> </w:t>
-      </w:r>
-      <w:r>
-        <w:rPr>
-          <w:w w:val="105"/>
-          <w:sz w:val="20"/>
-          <w:szCs w:val="20"/>
+          <w:sz w:val="19"/>
+          <w:szCs w:val="19"/>
+        </w:rPr>
+        <w:t xml:space="preserve"> </w:t>
+      </w:r>
+      <w:r>
+        <w:rPr>
+          <w:w w:val="105"/>
+          <w:sz w:val="19"/>
+          <w:szCs w:val="19"/>
         </w:rPr>
         <w:t>de</w:t>
       </w:r>
@@ -2712,16 +2694,16 @@
         <w:rPr>
           <w:spacing w:val="-6"/>
           <w:w w:val="105"/>
-          <w:sz w:val="20"/>
-          <w:szCs w:val="20"/>
-        </w:rPr>
-        <w:t xml:space="preserve"> </w:t>
-      </w:r>
-      <w:r>
-        <w:rPr>
-          <w:w w:val="105"/>
-          <w:sz w:val="20"/>
-          <w:szCs w:val="20"/>
+          <w:sz w:val="19"/>
+          <w:szCs w:val="19"/>
+        </w:rPr>
+        <w:t xml:space="preserve"> </w:t>
+      </w:r>
+      <w:r>
+        <w:rPr>
+          <w:w w:val="105"/>
+          <w:sz w:val="19"/>
+          <w:szCs w:val="19"/>
         </w:rPr>
         <w:t>los</w:t>
       </w:r>
@@ -2729,16 +2711,16 @@
         <w:rPr>
           <w:spacing w:val="-5"/>
           <w:w w:val="105"/>
-          <w:sz w:val="20"/>
-          <w:szCs w:val="20"/>
-        </w:rPr>
-        <w:t xml:space="preserve"> </w:t>
-      </w:r>
-      <w:r>
-        <w:rPr>
-          <w:w w:val="105"/>
-          <w:sz w:val="20"/>
-          <w:szCs w:val="20"/>
+          <w:sz w:val="19"/>
+          <w:szCs w:val="19"/>
+        </w:rPr>
+        <w:t xml:space="preserve"> </w:t>
+      </w:r>
+      <w:r>
+        <w:rPr>
+          <w:w w:val="105"/>
+          <w:sz w:val="19"/>
+          <w:szCs w:val="19"/>
         </w:rPr>
         <w:t>Expedientes</w:t>
       </w:r>
@@ -2746,16 +2728,16 @@
         <w:rPr>
           <w:spacing w:val="-5"/>
           <w:w w:val="105"/>
-          <w:sz w:val="20"/>
-          <w:szCs w:val="20"/>
-        </w:rPr>
-        <w:t xml:space="preserve"> </w:t>
-      </w:r>
-      <w:r>
-        <w:rPr>
-          <w:w w:val="105"/>
-          <w:sz w:val="20"/>
-          <w:szCs w:val="20"/>
+          <w:sz w:val="19"/>
+          <w:szCs w:val="19"/>
+        </w:rPr>
+        <w:t xml:space="preserve"> </w:t>
+      </w:r>
+      <w:r>
+        <w:rPr>
+          <w:w w:val="105"/>
+          <w:sz w:val="19"/>
+          <w:szCs w:val="19"/>
         </w:rPr>
         <w:t>Originales</w:t>
       </w:r>
@@ -2763,16 +2745,16 @@
         <w:rPr>
           <w:spacing w:val="-5"/>
           <w:w w:val="105"/>
-          <w:sz w:val="20"/>
-          <w:szCs w:val="20"/>
-        </w:rPr>
-        <w:t xml:space="preserve"> </w:t>
-      </w:r>
-      <w:r>
-        <w:rPr>
-          <w:w w:val="105"/>
-          <w:sz w:val="20"/>
-          <w:szCs w:val="20"/>
+          <w:sz w:val="19"/>
+          <w:szCs w:val="19"/>
+        </w:rPr>
+        <w:t xml:space="preserve"> </w:t>
+      </w:r>
+      <w:r>
+        <w:rPr>
+          <w:w w:val="105"/>
+          <w:sz w:val="19"/>
+          <w:szCs w:val="19"/>
         </w:rPr>
         <w:t>bajo</w:t>
       </w:r>
@@ -2780,16 +2762,16 @@
         <w:rPr>
           <w:spacing w:val="-6"/>
           <w:w w:val="105"/>
-          <w:sz w:val="20"/>
-          <w:szCs w:val="20"/>
-        </w:rPr>
-        <w:t xml:space="preserve"> </w:t>
-      </w:r>
-      <w:r>
-        <w:rPr>
-          <w:w w:val="105"/>
-          <w:sz w:val="20"/>
-          <w:szCs w:val="20"/>
+          <w:sz w:val="19"/>
+          <w:szCs w:val="19"/>
+        </w:rPr>
+        <w:t xml:space="preserve"> </w:t>
+      </w:r>
+      <w:r>
+        <w:rPr>
+          <w:w w:val="105"/>
+          <w:sz w:val="19"/>
+          <w:szCs w:val="19"/>
         </w:rPr>
         <w:t>responsabilidad</w:t>
       </w:r>
@@ -2797,16 +2779,16 @@
         <w:rPr>
           <w:spacing w:val="-6"/>
           <w:w w:val="105"/>
-          <w:sz w:val="20"/>
-          <w:szCs w:val="20"/>
-        </w:rPr>
-        <w:t xml:space="preserve"> </w:t>
-      </w:r>
-      <w:r>
-        <w:rPr>
-          <w:w w:val="105"/>
-          <w:sz w:val="20"/>
-          <w:szCs w:val="20"/>
+          <w:sz w:val="19"/>
+          <w:szCs w:val="19"/>
+        </w:rPr>
+        <w:t xml:space="preserve"> </w:t>
+      </w:r>
+      <w:r>
+        <w:rPr>
+          <w:w w:val="105"/>
+          <w:sz w:val="19"/>
+          <w:szCs w:val="19"/>
         </w:rPr>
         <w:t>en</w:t>
       </w:r>
@@ -2814,16 +2796,16 @@
         <w:rPr>
           <w:spacing w:val="-6"/>
           <w:w w:val="105"/>
-          <w:sz w:val="20"/>
-          <w:szCs w:val="20"/>
-        </w:rPr>
-        <w:t xml:space="preserve"> </w:t>
-      </w:r>
-      <w:r>
-        <w:rPr>
-          <w:w w:val="105"/>
-          <w:sz w:val="20"/>
-          <w:szCs w:val="20"/>
+          <w:sz w:val="19"/>
+          <w:szCs w:val="19"/>
+        </w:rPr>
+        <w:t xml:space="preserve"> </w:t>
+      </w:r>
+      <w:r>
+        <w:rPr>
+          <w:w w:val="105"/>
+          <w:sz w:val="19"/>
+          <w:szCs w:val="19"/>
         </w:rPr>
         <w:t>caso</w:t>
       </w:r>
@@ -2831,16 +2813,16 @@
         <w:rPr>
           <w:spacing w:val="-6"/>
           <w:w w:val="105"/>
-          <w:sz w:val="20"/>
-          <w:szCs w:val="20"/>
-        </w:rPr>
-        <w:t xml:space="preserve"> </w:t>
-      </w:r>
-      <w:r>
-        <w:rPr>
-          <w:w w:val="105"/>
-          <w:sz w:val="20"/>
-          <w:szCs w:val="20"/>
+          <w:sz w:val="19"/>
+          <w:szCs w:val="19"/>
+        </w:rPr>
+        <w:t xml:space="preserve"> </w:t>
+      </w:r>
+      <w:r>
+        <w:rPr>
+          <w:w w:val="105"/>
+          <w:sz w:val="19"/>
+          <w:szCs w:val="19"/>
         </w:rPr>
         <w:t>de</w:t>
       </w:r>
@@ -2848,16 +2830,16 @@
         <w:rPr>
           <w:spacing w:val="-6"/>
           <w:w w:val="105"/>
-          <w:sz w:val="20"/>
-          <w:szCs w:val="20"/>
-        </w:rPr>
-        <w:t xml:space="preserve"> </w:t>
-      </w:r>
-      <w:r>
-        <w:rPr>
-          <w:w w:val="105"/>
-          <w:sz w:val="20"/>
-          <w:szCs w:val="20"/>
+          <w:sz w:val="19"/>
+          <w:szCs w:val="19"/>
+        </w:rPr>
+        <w:t xml:space="preserve"> </w:t>
+      </w:r>
+      <w:r>
+        <w:rPr>
+          <w:w w:val="105"/>
+          <w:sz w:val="19"/>
+          <w:szCs w:val="19"/>
         </w:rPr>
         <w:t>deterioro</w:t>
       </w:r>
@@ -2865,16 +2847,16 @@
         <w:rPr>
           <w:spacing w:val="-6"/>
           <w:w w:val="105"/>
-          <w:sz w:val="20"/>
-          <w:szCs w:val="20"/>
-        </w:rPr>
-        <w:t xml:space="preserve"> </w:t>
-      </w:r>
-      <w:r>
-        <w:rPr>
-          <w:w w:val="105"/>
-          <w:sz w:val="20"/>
-          <w:szCs w:val="20"/>
+          <w:sz w:val="19"/>
+          <w:szCs w:val="19"/>
+        </w:rPr>
+        <w:t xml:space="preserve"> </w:t>
+      </w:r>
+      <w:r>
+        <w:rPr>
+          <w:w w:val="105"/>
+          <w:sz w:val="19"/>
+          <w:szCs w:val="19"/>
         </w:rPr>
         <w:t>o</w:t>
       </w:r>
@@ -2882,16 +2864,16 @@
         <w:rPr>
           <w:spacing w:val="-6"/>
           <w:w w:val="105"/>
-          <w:sz w:val="20"/>
-          <w:szCs w:val="20"/>
-        </w:rPr>
-        <w:t xml:space="preserve"> </w:t>
-      </w:r>
-      <w:r>
-        <w:rPr>
-          <w:w w:val="105"/>
-          <w:sz w:val="20"/>
-          <w:szCs w:val="20"/>
+          <w:sz w:val="19"/>
+          <w:szCs w:val="19"/>
+        </w:rPr>
+        <w:t xml:space="preserve"> </w:t>
+      </w:r>
+      <w:r>
+        <w:rPr>
+          <w:w w:val="105"/>
+          <w:sz w:val="19"/>
+          <w:szCs w:val="19"/>
         </w:rPr>
         <w:t>pérdida</w:t>
       </w:r>
@@ -2899,16 +2881,16 @@
         <w:rPr>
           <w:spacing w:val="-6"/>
           <w:w w:val="105"/>
-          <w:sz w:val="20"/>
-          <w:szCs w:val="20"/>
-        </w:rPr>
-        <w:t xml:space="preserve"> </w:t>
-      </w:r>
-      <w:r>
-        <w:rPr>
-          <w:w w:val="105"/>
-          <w:sz w:val="20"/>
-          <w:szCs w:val="20"/>
+          <w:sz w:val="19"/>
+          <w:szCs w:val="19"/>
+        </w:rPr>
+        <w:t xml:space="preserve"> </w:t>
+      </w:r>
+      <w:r>
+        <w:rPr>
+          <w:w w:val="105"/>
+          <w:sz w:val="19"/>
+          <w:szCs w:val="19"/>
         </w:rPr>
         <w:t>del</w:t>
       </w:r>
@@ -2916,16 +2898,16 @@
         <w:rPr>
           <w:spacing w:val="-6"/>
           <w:w w:val="105"/>
-          <w:sz w:val="20"/>
-          <w:szCs w:val="20"/>
-        </w:rPr>
-        <w:t xml:space="preserve"> </w:t>
-      </w:r>
-      <w:r>
-        <w:rPr>
-          <w:w w:val="105"/>
-          <w:sz w:val="20"/>
-          <w:szCs w:val="20"/>
+          <w:sz w:val="19"/>
+          <w:szCs w:val="19"/>
+        </w:rPr>
+        <w:t xml:space="preserve"> </w:t>
+      </w:r>
+      <w:r>
+        <w:rPr>
+          <w:w w:val="105"/>
+          <w:sz w:val="19"/>
+          <w:szCs w:val="19"/>
         </w:rPr>
         <w:t>mismo</w:t>
       </w:r>
@@ -2933,16 +2915,16 @@
         <w:rPr>
           <w:spacing w:val="-6"/>
           <w:w w:val="105"/>
-          <w:sz w:val="20"/>
-          <w:szCs w:val="20"/>
-        </w:rPr>
-        <w:t xml:space="preserve"> </w:t>
-      </w:r>
-      <w:r>
-        <w:rPr>
-          <w:w w:val="105"/>
-          <w:sz w:val="20"/>
-          <w:szCs w:val="20"/>
+          <w:sz w:val="19"/>
+          <w:szCs w:val="19"/>
+        </w:rPr>
+        <w:t xml:space="preserve"> </w:t>
+      </w:r>
+      <w:r>
+        <w:rPr>
+          <w:w w:val="105"/>
+          <w:sz w:val="19"/>
+          <w:szCs w:val="19"/>
         </w:rPr>
         <w:t>serán</w:t>
       </w:r>
@@ -2950,16 +2932,16 @@
         <w:rPr>
           <w:spacing w:val="-6"/>
           <w:w w:val="105"/>
-          <w:sz w:val="20"/>
-          <w:szCs w:val="20"/>
-        </w:rPr>
-        <w:t xml:space="preserve"> </w:t>
-      </w:r>
-      <w:r>
-        <w:rPr>
-          <w:w w:val="105"/>
-          <w:sz w:val="20"/>
-          <w:szCs w:val="20"/>
+          <w:sz w:val="19"/>
+          <w:szCs w:val="19"/>
+        </w:rPr>
+        <w:t xml:space="preserve"> </w:t>
+      </w:r>
+      <w:r>
+        <w:rPr>
+          <w:w w:val="105"/>
+          <w:sz w:val="19"/>
+          <w:szCs w:val="19"/>
         </w:rPr>
         <w:t>responsabilidad</w:t>
       </w:r>
@@ -2967,16 +2949,16 @@
         <w:rPr>
           <w:spacing w:val="-6"/>
           <w:w w:val="105"/>
-          <w:sz w:val="20"/>
-          <w:szCs w:val="20"/>
-        </w:rPr>
-        <w:t xml:space="preserve"> </w:t>
-      </w:r>
-      <w:r>
-        <w:rPr>
-          <w:w w:val="105"/>
-          <w:sz w:val="20"/>
-          <w:szCs w:val="20"/>
+          <w:sz w:val="19"/>
+          <w:szCs w:val="19"/>
+        </w:rPr>
+        <w:t xml:space="preserve"> </w:t>
+      </w:r>
+      <w:r>
+        <w:rPr>
+          <w:w w:val="105"/>
+          <w:sz w:val="19"/>
+          <w:szCs w:val="19"/>
         </w:rPr>
         <w:t>de</w:t>
       </w:r>
@@ -2984,16 +2966,16 @@
         <w:rPr>
           <w:spacing w:val="-6"/>
           <w:w w:val="105"/>
-          <w:sz w:val="20"/>
-          <w:szCs w:val="20"/>
-        </w:rPr>
-        <w:t xml:space="preserve"> </w:t>
-      </w:r>
-      <w:r>
-        <w:rPr>
-          <w:w w:val="105"/>
-          <w:sz w:val="20"/>
-          <w:szCs w:val="20"/>
+          <w:sz w:val="19"/>
+          <w:szCs w:val="19"/>
+        </w:rPr>
+        <w:t xml:space="preserve"> </w:t>
+      </w:r>
+      <w:r>
+        <w:rPr>
+          <w:w w:val="105"/>
+          <w:sz w:val="19"/>
+          <w:szCs w:val="19"/>
         </w:rPr>
         <w:t>vuestra</w:t>
       </w:r>
@@ -3001,16 +2983,16 @@
         <w:rPr>
           <w:spacing w:val="-6"/>
           <w:w w:val="105"/>
-          <w:sz w:val="20"/>
-          <w:szCs w:val="20"/>
-        </w:rPr>
-        <w:t xml:space="preserve"> </w:t>
-      </w:r>
-      <w:r>
-        <w:rPr>
-          <w:w w:val="105"/>
-          <w:sz w:val="20"/>
-          <w:szCs w:val="20"/>
+          <w:sz w:val="19"/>
+          <w:szCs w:val="19"/>
+        </w:rPr>
+        <w:t xml:space="preserve"> </w:t>
+      </w:r>
+      <w:r>
+        <w:rPr>
+          <w:w w:val="105"/>
+          <w:sz w:val="19"/>
+          <w:szCs w:val="19"/>
         </w:rPr>
         <w:t>empresa,</w:t>
       </w:r>
@@ -3018,16 +3000,16 @@
         <w:rPr>
           <w:spacing w:val="-6"/>
           <w:w w:val="105"/>
-          <w:sz w:val="20"/>
-          <w:szCs w:val="20"/>
-        </w:rPr>
-        <w:t xml:space="preserve"> </w:t>
-      </w:r>
-      <w:r>
-        <w:rPr>
-          <w:w w:val="105"/>
-          <w:sz w:val="20"/>
-          <w:szCs w:val="20"/>
+          <w:sz w:val="19"/>
+          <w:szCs w:val="19"/>
+        </w:rPr>
+        <w:t xml:space="preserve"> </w:t>
+      </w:r>
+      <w:r>
+        <w:rPr>
+          <w:w w:val="105"/>
+          <w:sz w:val="19"/>
+          <w:szCs w:val="19"/>
         </w:rPr>
         <w:t>por</w:t>
       </w:r>
@@ -3035,16 +3017,16 @@
         <w:rPr>
           <w:spacing w:val="-6"/>
           <w:w w:val="105"/>
-          <w:sz w:val="20"/>
-          <w:szCs w:val="20"/>
-        </w:rPr>
-        <w:t xml:space="preserve"> </w:t>
-      </w:r>
-      <w:r>
-        <w:rPr>
-          <w:w w:val="105"/>
-          <w:sz w:val="20"/>
-          <w:szCs w:val="20"/>
+          <w:sz w:val="19"/>
+          <w:szCs w:val="19"/>
+        </w:rPr>
+        <w:t xml:space="preserve"> </w:t>
+      </w:r>
+      <w:r>
+        <w:rPr>
+          <w:w w:val="105"/>
+          <w:sz w:val="19"/>
+          <w:szCs w:val="19"/>
         </w:rPr>
         <w:t>lo</w:t>
       </w:r>
@@ -3052,24 +3034,24 @@
         <w:rPr>
           <w:spacing w:val="-6"/>
           <w:w w:val="105"/>
-          <w:sz w:val="20"/>
-          <w:szCs w:val="20"/>
-        </w:rPr>
-        <w:t xml:space="preserve"> </w:t>
-      </w:r>
-      <w:r>
-        <w:rPr>
-          <w:w w:val="105"/>
-          <w:sz w:val="20"/>
-          <w:szCs w:val="20"/>
+          <w:sz w:val="19"/>
+          <w:szCs w:val="19"/>
+        </w:rPr>
+        <w:t xml:space="preserve"> </w:t>
+      </w:r>
+      <w:r>
+        <w:rPr>
+          <w:w w:val="105"/>
+          <w:sz w:val="19"/>
+          <w:szCs w:val="19"/>
         </w:rPr>
         <w:t>que, deberán devolverse dichos expedientes en los plazos establecidos, caso contrario se aplicará penalidad respectiva</w:t>
       </w:r>
       <w:r>
         <w:rPr>
           <w:w w:val="105"/>
-          <w:sz w:val="20"/>
-          <w:szCs w:val="20"/>
+          <w:sz w:val="19"/>
+          <w:szCs w:val="19"/>
         </w:rPr>
         <w:t>.</w:t>
       </w:r>
@@ -3080,16 +3062,16 @@
         <w:spacing w:before="187"/>
         <w:jc w:val="both"/>
         <w:rPr>
-          <w:sz w:val="20"/>
-          <w:szCs w:val="20"/>
+          <w:sz w:val="19"/>
+          <w:szCs w:val="19"/>
         </w:rPr>
       </w:pPr>
       <w:r>
         <w:rPr>
           <w:b/>
           <w:w w:val="105"/>
-          <w:sz w:val="20"/>
-          <w:szCs w:val="20"/>
+          <w:sz w:val="19"/>
+          <w:szCs w:val="19"/>
         </w:rPr>
         <w:t>IMPORTANTE:</w:t>
       </w:r>
@@ -3098,16 +3080,16 @@
           <w:b/>
           <w:spacing w:val="-6"/>
           <w:w w:val="105"/>
-          <w:sz w:val="20"/>
-          <w:szCs w:val="20"/>
-        </w:rPr>
-        <w:t xml:space="preserve"> </w:t>
-      </w:r>
-      <w:r>
-        <w:rPr>
-          <w:w w:val="105"/>
-          <w:sz w:val="20"/>
-          <w:szCs w:val="20"/>
+          <w:sz w:val="19"/>
+          <w:szCs w:val="19"/>
+        </w:rPr>
+        <w:t xml:space="preserve"> </w:t>
+      </w:r>
+      <w:r>
+        <w:rPr>
+          <w:w w:val="105"/>
+          <w:sz w:val="19"/>
+          <w:szCs w:val="19"/>
         </w:rPr>
         <w:t>EL</w:t>
       </w:r>
@@ -3115,16 +3097,16 @@
         <w:rPr>
           <w:spacing w:val="-6"/>
           <w:w w:val="105"/>
-          <w:sz w:val="20"/>
-          <w:szCs w:val="20"/>
-        </w:rPr>
-        <w:t xml:space="preserve"> </w:t>
-      </w:r>
-      <w:r>
-        <w:rPr>
-          <w:w w:val="105"/>
-          <w:sz w:val="20"/>
-          <w:szCs w:val="20"/>
+          <w:sz w:val="19"/>
+          <w:szCs w:val="19"/>
+        </w:rPr>
+        <w:t xml:space="preserve"> </w:t>
+      </w:r>
+      <w:r>
+        <w:rPr>
+          <w:w w:val="105"/>
+          <w:sz w:val="19"/>
+          <w:szCs w:val="19"/>
         </w:rPr>
         <w:t>CLIENTE</w:t>
       </w:r>
@@ -3132,16 +3114,16 @@
         <w:rPr>
           <w:spacing w:val="-7"/>
           <w:w w:val="105"/>
-          <w:sz w:val="20"/>
-          <w:szCs w:val="20"/>
-        </w:rPr>
-        <w:t xml:space="preserve"> </w:t>
-      </w:r>
-      <w:r>
-        <w:rPr>
-          <w:w w:val="105"/>
-          <w:sz w:val="20"/>
-          <w:szCs w:val="20"/>
+          <w:sz w:val="19"/>
+          <w:szCs w:val="19"/>
+        </w:rPr>
+        <w:t xml:space="preserve"> </w:t>
+      </w:r>
+      <w:r>
+        <w:rPr>
+          <w:w w:val="105"/>
+          <w:sz w:val="19"/>
+          <w:szCs w:val="19"/>
         </w:rPr>
         <w:t>ES</w:t>
       </w:r>
@@ -3149,16 +3131,16 @@
         <w:rPr>
           <w:spacing w:val="-7"/>
           <w:w w:val="105"/>
-          <w:sz w:val="20"/>
-          <w:szCs w:val="20"/>
-        </w:rPr>
-        <w:t xml:space="preserve"> </w:t>
-      </w:r>
-      <w:r>
-        <w:rPr>
-          <w:w w:val="105"/>
-          <w:sz w:val="20"/>
-          <w:szCs w:val="20"/>
+          <w:sz w:val="19"/>
+          <w:szCs w:val="19"/>
+        </w:rPr>
+        <w:t xml:space="preserve"> </w:t>
+      </w:r>
+      <w:r>
+        <w:rPr>
+          <w:w w:val="105"/>
+          <w:sz w:val="19"/>
+          <w:szCs w:val="19"/>
         </w:rPr>
         <w:t>LA</w:t>
       </w:r>
@@ -3166,16 +3148,16 @@
         <w:rPr>
           <w:spacing w:val="-8"/>
           <w:w w:val="105"/>
-          <w:sz w:val="20"/>
-          <w:szCs w:val="20"/>
-        </w:rPr>
-        <w:t xml:space="preserve"> </w:t>
-      </w:r>
-      <w:r>
-        <w:rPr>
-          <w:w w:val="105"/>
-          <w:sz w:val="20"/>
-          <w:szCs w:val="20"/>
+          <w:sz w:val="19"/>
+          <w:szCs w:val="19"/>
+        </w:rPr>
+        <w:t xml:space="preserve"> </w:t>
+      </w:r>
+      <w:r>
+        <w:rPr>
+          <w:w w:val="105"/>
+          <w:sz w:val="19"/>
+          <w:szCs w:val="19"/>
         </w:rPr>
         <w:t>RAZÓN</w:t>
       </w:r>
@@ -3183,16 +3165,16 @@
         <w:rPr>
           <w:spacing w:val="-7"/>
           <w:w w:val="105"/>
-          <w:sz w:val="20"/>
-          <w:szCs w:val="20"/>
-        </w:rPr>
-        <w:t xml:space="preserve"> </w:t>
-      </w:r>
-      <w:r>
-        <w:rPr>
-          <w:w w:val="105"/>
-          <w:sz w:val="20"/>
-          <w:szCs w:val="20"/>
+          <w:sz w:val="19"/>
+          <w:szCs w:val="19"/>
+        </w:rPr>
+        <w:t xml:space="preserve"> </w:t>
+      </w:r>
+      <w:r>
+        <w:rPr>
+          <w:w w:val="105"/>
+          <w:sz w:val="19"/>
+          <w:szCs w:val="19"/>
         </w:rPr>
         <w:t>DE</w:t>
       </w:r>
@@ -3200,16 +3182,16 @@
         <w:rPr>
           <w:spacing w:val="-7"/>
           <w:w w:val="105"/>
-          <w:sz w:val="20"/>
-          <w:szCs w:val="20"/>
-        </w:rPr>
-        <w:t xml:space="preserve"> </w:t>
-      </w:r>
-      <w:r>
-        <w:rPr>
-          <w:w w:val="105"/>
-          <w:sz w:val="20"/>
-          <w:szCs w:val="20"/>
+          <w:sz w:val="19"/>
+          <w:szCs w:val="19"/>
+        </w:rPr>
+        <w:t xml:space="preserve"> </w:t>
+      </w:r>
+      <w:r>
+        <w:rPr>
+          <w:w w:val="105"/>
+          <w:sz w:val="19"/>
+          <w:szCs w:val="19"/>
         </w:rPr>
         <w:t>SER</w:t>
       </w:r>
@@ -3217,16 +3199,16 @@
         <w:rPr>
           <w:spacing w:val="-8"/>
           <w:w w:val="105"/>
-          <w:sz w:val="20"/>
-          <w:szCs w:val="20"/>
-        </w:rPr>
-        <w:t xml:space="preserve"> </w:t>
-      </w:r>
-      <w:r>
-        <w:rPr>
-          <w:w w:val="105"/>
-          <w:sz w:val="20"/>
-          <w:szCs w:val="20"/>
+          <w:sz w:val="19"/>
+          <w:szCs w:val="19"/>
+        </w:rPr>
+        <w:t xml:space="preserve"> </w:t>
+      </w:r>
+      <w:r>
+        <w:rPr>
+          <w:w w:val="105"/>
+          <w:sz w:val="19"/>
+          <w:szCs w:val="19"/>
         </w:rPr>
         <w:t>DE</w:t>
       </w:r>
@@ -3234,16 +3216,16 @@
         <w:rPr>
           <w:spacing w:val="-7"/>
           <w:w w:val="105"/>
-          <w:sz w:val="20"/>
-          <w:szCs w:val="20"/>
-        </w:rPr>
-        <w:t xml:space="preserve"> </w:t>
-      </w:r>
-      <w:r>
-        <w:rPr>
-          <w:w w:val="105"/>
-          <w:sz w:val="20"/>
-          <w:szCs w:val="20"/>
+          <w:sz w:val="19"/>
+          <w:szCs w:val="19"/>
+        </w:rPr>
+        <w:t xml:space="preserve"> </w:t>
+      </w:r>
+      <w:r>
+        <w:rPr>
+          <w:w w:val="105"/>
+          <w:sz w:val="19"/>
+          <w:szCs w:val="19"/>
         </w:rPr>
         <w:t>LA</w:t>
       </w:r>
@@ -3251,16 +3233,16 @@
         <w:rPr>
           <w:spacing w:val="-7"/>
           <w:w w:val="105"/>
-          <w:sz w:val="20"/>
-          <w:szCs w:val="20"/>
-        </w:rPr>
-        <w:t xml:space="preserve"> </w:t>
-      </w:r>
-      <w:r>
-        <w:rPr>
-          <w:w w:val="105"/>
-          <w:sz w:val="20"/>
-          <w:szCs w:val="20"/>
+          <w:sz w:val="19"/>
+          <w:szCs w:val="19"/>
+        </w:rPr>
+        <w:t xml:space="preserve"> </w:t>
+      </w:r>
+      <w:r>
+        <w:rPr>
+          <w:w w:val="105"/>
+          <w:sz w:val="19"/>
+          <w:szCs w:val="19"/>
         </w:rPr>
         <w:t>EMPRESA.</w:t>
       </w:r>
@@ -3268,16 +3250,16 @@
         <w:rPr>
           <w:spacing w:val="-7"/>
           <w:w w:val="105"/>
-          <w:sz w:val="20"/>
-          <w:szCs w:val="20"/>
-        </w:rPr>
-        <w:t xml:space="preserve"> </w:t>
-      </w:r>
-      <w:r>
-        <w:rPr>
-          <w:w w:val="105"/>
-          <w:sz w:val="20"/>
-          <w:szCs w:val="20"/>
+          <w:sz w:val="19"/>
+          <w:szCs w:val="19"/>
+        </w:rPr>
+        <w:t xml:space="preserve"> </w:t>
+      </w:r>
+      <w:r>
+        <w:rPr>
+          <w:w w:val="105"/>
+          <w:sz w:val="19"/>
+          <w:szCs w:val="19"/>
         </w:rPr>
         <w:t>Informar</w:t>
       </w:r>
@@ -3285,16 +3267,16 @@
         <w:rPr>
           <w:spacing w:val="-8"/>
           <w:w w:val="105"/>
-          <w:sz w:val="20"/>
-          <w:szCs w:val="20"/>
-        </w:rPr>
-        <w:t xml:space="preserve"> </w:t>
-      </w:r>
-      <w:r>
-        <w:rPr>
-          <w:w w:val="105"/>
-          <w:sz w:val="20"/>
-          <w:szCs w:val="20"/>
+          <w:sz w:val="19"/>
+          <w:szCs w:val="19"/>
+        </w:rPr>
+        <w:t xml:space="preserve"> </w:t>
+      </w:r>
+      <w:r>
+        <w:rPr>
+          <w:w w:val="105"/>
+          <w:sz w:val="19"/>
+          <w:szCs w:val="19"/>
         </w:rPr>
         <w:t>las</w:t>
       </w:r>
@@ -3302,16 +3284,16 @@
         <w:rPr>
           <w:spacing w:val="-7"/>
           <w:w w:val="105"/>
-          <w:sz w:val="20"/>
-          <w:szCs w:val="20"/>
-        </w:rPr>
-        <w:t xml:space="preserve"> </w:t>
-      </w:r>
-      <w:r>
-        <w:rPr>
-          <w:w w:val="105"/>
-          <w:sz w:val="20"/>
-          <w:szCs w:val="20"/>
+          <w:sz w:val="19"/>
+          <w:szCs w:val="19"/>
+        </w:rPr>
+        <w:t xml:space="preserve"> </w:t>
+      </w:r>
+      <w:r>
+        <w:rPr>
+          <w:w w:val="105"/>
+          <w:sz w:val="19"/>
+          <w:szCs w:val="19"/>
         </w:rPr>
         <w:t>observaciones</w:t>
       </w:r>
@@ -3319,16 +3301,16 @@
         <w:rPr>
           <w:spacing w:val="-6"/>
           <w:w w:val="105"/>
-          <w:sz w:val="20"/>
-          <w:szCs w:val="20"/>
-        </w:rPr>
-        <w:t xml:space="preserve"> </w:t>
-      </w:r>
-      <w:r>
-        <w:rPr>
-          <w:w w:val="105"/>
-          <w:sz w:val="20"/>
-          <w:szCs w:val="20"/>
+          <w:sz w:val="19"/>
+          <w:szCs w:val="19"/>
+        </w:rPr>
+        <w:t xml:space="preserve"> </w:t>
+      </w:r>
+      <w:r>
+        <w:rPr>
+          <w:w w:val="105"/>
+          <w:sz w:val="19"/>
+          <w:szCs w:val="19"/>
         </w:rPr>
         <w:t>encontrados</w:t>
       </w:r>
@@ -3336,16 +3318,16 @@
         <w:rPr>
           <w:spacing w:val="-6"/>
           <w:w w:val="105"/>
-          <w:sz w:val="20"/>
-          <w:szCs w:val="20"/>
-        </w:rPr>
-        <w:t xml:space="preserve"> </w:t>
-      </w:r>
-      <w:r>
-        <w:rPr>
-          <w:w w:val="105"/>
-          <w:sz w:val="20"/>
-          <w:szCs w:val="20"/>
+          <w:sz w:val="19"/>
+          <w:szCs w:val="19"/>
+        </w:rPr>
+        <w:t xml:space="preserve"> </w:t>
+      </w:r>
+      <w:r>
+        <w:rPr>
+          <w:w w:val="105"/>
+          <w:sz w:val="19"/>
+          <w:szCs w:val="19"/>
         </w:rPr>
         <w:t>en</w:t>
       </w:r>
@@ -3353,16 +3335,16 @@
         <w:rPr>
           <w:spacing w:val="-6"/>
           <w:w w:val="105"/>
-          <w:sz w:val="20"/>
-          <w:szCs w:val="20"/>
-        </w:rPr>
-        <w:t xml:space="preserve"> </w:t>
-      </w:r>
-      <w:r>
-        <w:rPr>
-          <w:w w:val="105"/>
-          <w:sz w:val="20"/>
-          <w:szCs w:val="20"/>
+          <w:sz w:val="19"/>
+          <w:szCs w:val="19"/>
+        </w:rPr>
+        <w:t xml:space="preserve"> </w:t>
+      </w:r>
+      <w:r>
+        <w:rPr>
+          <w:w w:val="105"/>
+          <w:sz w:val="19"/>
+          <w:szCs w:val="19"/>
         </w:rPr>
         <w:t>los</w:t>
       </w:r>
@@ -3370,16 +3352,16 @@
         <w:rPr>
           <w:spacing w:val="-6"/>
           <w:w w:val="105"/>
-          <w:sz w:val="20"/>
-          <w:szCs w:val="20"/>
-        </w:rPr>
-        <w:t xml:space="preserve"> </w:t>
-      </w:r>
-      <w:r>
-        <w:rPr>
-          <w:w w:val="105"/>
-          <w:sz w:val="20"/>
-          <w:szCs w:val="20"/>
+          <w:sz w:val="19"/>
+          <w:szCs w:val="19"/>
+        </w:rPr>
+        <w:t xml:space="preserve"> </w:t>
+      </w:r>
+      <w:r>
+        <w:rPr>
+          <w:w w:val="105"/>
+          <w:sz w:val="19"/>
+          <w:szCs w:val="19"/>
         </w:rPr>
         <w:t>trabajos</w:t>
       </w:r>
@@ -3387,16 +3369,16 @@
         <w:rPr>
           <w:spacing w:val="-6"/>
           <w:w w:val="105"/>
-          <w:sz w:val="20"/>
-          <w:szCs w:val="20"/>
-        </w:rPr>
-        <w:t xml:space="preserve"> </w:t>
-      </w:r>
-      <w:r>
-        <w:rPr>
-          <w:w w:val="105"/>
-          <w:sz w:val="20"/>
-          <w:szCs w:val="20"/>
+          <w:sz w:val="19"/>
+          <w:szCs w:val="19"/>
+        </w:rPr>
+        <w:t xml:space="preserve"> </w:t>
+      </w:r>
+      <w:r>
+        <w:rPr>
+          <w:w w:val="105"/>
+          <w:sz w:val="19"/>
+          <w:szCs w:val="19"/>
         </w:rPr>
         <w:t>ejecutados</w:t>
       </w:r>
@@ -3404,16 +3386,16 @@
         <w:rPr>
           <w:spacing w:val="-6"/>
           <w:w w:val="105"/>
-          <w:sz w:val="20"/>
-          <w:szCs w:val="20"/>
-        </w:rPr>
-        <w:t xml:space="preserve"> </w:t>
-      </w:r>
-      <w:r>
-        <w:rPr>
-          <w:w w:val="105"/>
-          <w:sz w:val="20"/>
-          <w:szCs w:val="20"/>
+          <w:sz w:val="19"/>
+          <w:szCs w:val="19"/>
+        </w:rPr>
+        <w:t xml:space="preserve"> </w:t>
+      </w:r>
+      <w:r>
+        <w:rPr>
+          <w:w w:val="105"/>
+          <w:sz w:val="19"/>
+          <w:szCs w:val="19"/>
         </w:rPr>
         <w:t>máximo</w:t>
       </w:r>
@@ -3421,16 +3403,16 @@
         <w:rPr>
           <w:spacing w:val="-8"/>
           <w:w w:val="105"/>
-          <w:sz w:val="20"/>
-          <w:szCs w:val="20"/>
-        </w:rPr>
-        <w:t xml:space="preserve"> </w:t>
-      </w:r>
-      <w:r>
-        <w:rPr>
-          <w:w w:val="105"/>
-          <w:sz w:val="20"/>
-          <w:szCs w:val="20"/>
+          <w:sz w:val="19"/>
+          <w:szCs w:val="19"/>
+        </w:rPr>
+        <w:t xml:space="preserve"> </w:t>
+      </w:r>
+      <w:r>
+        <w:rPr>
+          <w:w w:val="105"/>
+          <w:sz w:val="19"/>
+          <w:szCs w:val="19"/>
         </w:rPr>
         <w:t>al</w:t>
       </w:r>
@@ -3438,16 +3420,16 @@
         <w:rPr>
           <w:spacing w:val="-7"/>
           <w:w w:val="105"/>
-          <w:sz w:val="20"/>
-          <w:szCs w:val="20"/>
-        </w:rPr>
-        <w:t xml:space="preserve"> </w:t>
-      </w:r>
-      <w:r>
-        <w:rPr>
-          <w:w w:val="105"/>
-          <w:sz w:val="20"/>
-          <w:szCs w:val="20"/>
+          <w:sz w:val="19"/>
+          <w:szCs w:val="19"/>
+        </w:rPr>
+        <w:t xml:space="preserve"> </w:t>
+      </w:r>
+      <w:r>
+        <w:rPr>
+          <w:w w:val="105"/>
+          <w:sz w:val="19"/>
+          <w:szCs w:val="19"/>
         </w:rPr>
         <w:t>día</w:t>
       </w:r>
@@ -3455,8 +3437,8 @@
         <w:rPr>
           <w:spacing w:val="-8"/>
           <w:w w:val="105"/>
-          <w:sz w:val="20"/>
-          <w:szCs w:val="20"/>
+          <w:sz w:val="19"/>
+          <w:szCs w:val="19"/>
         </w:rPr>
         <w:t xml:space="preserve"> </w:t>
       </w:r>
@@ -3464,8 +3446,8 @@
         <w:rPr>
           <w:spacing w:val="-2"/>
           <w:w w:val="105"/>
-          <w:sz w:val="20"/>
-          <w:szCs w:val="20"/>
+          <w:sz w:val="19"/>
+          <w:szCs w:val="19"/>
         </w:rPr>
         <w:t>siguiente</w:t>
       </w:r>
@@ -3476,16 +3458,16 @@
         <w:spacing w:before="28" w:line="271" w:lineRule="auto"/>
         <w:jc w:val="both"/>
         <w:rPr>
-          <w:sz w:val="20"/>
-          <w:szCs w:val="20"/>
+          <w:sz w:val="19"/>
+          <w:szCs w:val="19"/>
         </w:rPr>
       </w:pPr>
       <w:r>
         <w:rPr>
           <w:b/>
           <w:w w:val="105"/>
-          <w:sz w:val="20"/>
-          <w:szCs w:val="20"/>
+          <w:sz w:val="19"/>
+          <w:szCs w:val="19"/>
         </w:rPr>
         <w:t>Nota:</w:t>
       </w:r>
@@ -3494,16 +3476,16 @@
           <w:b/>
           <w:spacing w:val="-6"/>
           <w:w w:val="105"/>
-          <w:sz w:val="20"/>
-          <w:szCs w:val="20"/>
-        </w:rPr>
-        <w:t xml:space="preserve"> </w:t>
-      </w:r>
-      <w:r>
-        <w:rPr>
-          <w:w w:val="105"/>
-          <w:sz w:val="20"/>
-          <w:szCs w:val="20"/>
+          <w:sz w:val="19"/>
+          <w:szCs w:val="19"/>
+        </w:rPr>
+        <w:t xml:space="preserve"> </w:t>
+      </w:r>
+      <w:r>
+        <w:rPr>
+          <w:w w:val="105"/>
+          <w:sz w:val="19"/>
+          <w:szCs w:val="19"/>
         </w:rPr>
         <w:t>Consorcio</w:t>
       </w:r>
@@ -3511,16 +3493,16 @@
         <w:rPr>
           <w:spacing w:val="-7"/>
           <w:w w:val="105"/>
-          <w:sz w:val="20"/>
-          <w:szCs w:val="20"/>
-        </w:rPr>
-        <w:t xml:space="preserve"> </w:t>
-      </w:r>
-      <w:r>
-        <w:rPr>
-          <w:w w:val="105"/>
-          <w:sz w:val="20"/>
-          <w:szCs w:val="20"/>
+          <w:sz w:val="19"/>
+          <w:szCs w:val="19"/>
+        </w:rPr>
+        <w:t xml:space="preserve"> </w:t>
+      </w:r>
+      <w:r>
+        <w:rPr>
+          <w:w w:val="105"/>
+          <w:sz w:val="19"/>
+          <w:szCs w:val="19"/>
         </w:rPr>
         <w:t>SUPERVISOR</w:t>
       </w:r>
@@ -3528,16 +3510,16 @@
         <w:rPr>
           <w:spacing w:val="-8"/>
           <w:w w:val="105"/>
-          <w:sz w:val="20"/>
-          <w:szCs w:val="20"/>
-        </w:rPr>
-        <w:t xml:space="preserve"> </w:t>
-      </w:r>
-      <w:r>
-        <w:rPr>
-          <w:w w:val="105"/>
-          <w:sz w:val="20"/>
-          <w:szCs w:val="20"/>
+          <w:sz w:val="19"/>
+          <w:szCs w:val="19"/>
+        </w:rPr>
+        <w:t xml:space="preserve"> </w:t>
+      </w:r>
+      <w:r>
+        <w:rPr>
+          <w:w w:val="105"/>
+          <w:sz w:val="19"/>
+          <w:szCs w:val="19"/>
         </w:rPr>
         <w:t>informar</w:t>
       </w:r>
@@ -3545,16 +3527,16 @@
         <w:rPr>
           <w:spacing w:val="-8"/>
           <w:w w:val="105"/>
-          <w:sz w:val="20"/>
-          <w:szCs w:val="20"/>
-        </w:rPr>
-        <w:t xml:space="preserve"> </w:t>
-      </w:r>
-      <w:r>
-        <w:rPr>
-          <w:w w:val="105"/>
-          <w:sz w:val="20"/>
-          <w:szCs w:val="20"/>
+          <w:sz w:val="19"/>
+          <w:szCs w:val="19"/>
+        </w:rPr>
+        <w:t xml:space="preserve"> </w:t>
+      </w:r>
+      <w:r>
+        <w:rPr>
+          <w:w w:val="105"/>
+          <w:sz w:val="19"/>
+          <w:szCs w:val="19"/>
         </w:rPr>
         <w:t>diariamente</w:t>
       </w:r>
@@ -3562,16 +3544,16 @@
         <w:rPr>
           <w:spacing w:val="-6"/>
           <w:w w:val="105"/>
-          <w:sz w:val="20"/>
-          <w:szCs w:val="20"/>
-        </w:rPr>
-        <w:t xml:space="preserve"> </w:t>
-      </w:r>
-      <w:r>
-        <w:rPr>
-          <w:w w:val="105"/>
-          <w:sz w:val="20"/>
-          <w:szCs w:val="20"/>
+          <w:sz w:val="19"/>
+          <w:szCs w:val="19"/>
+        </w:rPr>
+        <w:t xml:space="preserve"> </w:t>
+      </w:r>
+      <w:r>
+        <w:rPr>
+          <w:w w:val="105"/>
+          <w:sz w:val="19"/>
+          <w:szCs w:val="19"/>
         </w:rPr>
         <w:t>con</w:t>
       </w:r>
@@ -3579,16 +3561,16 @@
         <w:rPr>
           <w:spacing w:val="-7"/>
           <w:w w:val="105"/>
-          <w:sz w:val="20"/>
-          <w:szCs w:val="20"/>
-        </w:rPr>
-        <w:t xml:space="preserve"> </w:t>
-      </w:r>
-      <w:r>
-        <w:rPr>
-          <w:w w:val="105"/>
-          <w:sz w:val="20"/>
-          <w:szCs w:val="20"/>
+          <w:sz w:val="19"/>
+          <w:szCs w:val="19"/>
+        </w:rPr>
+        <w:t xml:space="preserve"> </w:t>
+      </w:r>
+      <w:r>
+        <w:rPr>
+          <w:w w:val="105"/>
+          <w:sz w:val="19"/>
+          <w:szCs w:val="19"/>
         </w:rPr>
         <w:t>evidencias</w:t>
       </w:r>
@@ -3596,16 +3578,16 @@
         <w:rPr>
           <w:spacing w:val="-6"/>
           <w:w w:val="105"/>
-          <w:sz w:val="20"/>
-          <w:szCs w:val="20"/>
-        </w:rPr>
-        <w:t xml:space="preserve"> </w:t>
-      </w:r>
-      <w:r>
-        <w:rPr>
-          <w:w w:val="105"/>
-          <w:sz w:val="20"/>
-          <w:szCs w:val="20"/>
+          <w:sz w:val="19"/>
+          <w:szCs w:val="19"/>
+        </w:rPr>
+        <w:t xml:space="preserve"> </w:t>
+      </w:r>
+      <w:r>
+        <w:rPr>
+          <w:w w:val="105"/>
+          <w:sz w:val="19"/>
+          <w:szCs w:val="19"/>
         </w:rPr>
         <w:t>fotográficas</w:t>
       </w:r>
@@ -3613,16 +3595,16 @@
         <w:rPr>
           <w:spacing w:val="-6"/>
           <w:w w:val="105"/>
-          <w:sz w:val="20"/>
-          <w:szCs w:val="20"/>
-        </w:rPr>
-        <w:t xml:space="preserve"> </w:t>
-      </w:r>
-      <w:r>
-        <w:rPr>
-          <w:w w:val="105"/>
-          <w:sz w:val="20"/>
-          <w:szCs w:val="20"/>
+          <w:sz w:val="19"/>
+          <w:szCs w:val="19"/>
+        </w:rPr>
+        <w:t xml:space="preserve"> </w:t>
+      </w:r>
+      <w:r>
+        <w:rPr>
+          <w:w w:val="105"/>
+          <w:sz w:val="19"/>
+          <w:szCs w:val="19"/>
         </w:rPr>
         <w:t>en</w:t>
       </w:r>
@@ -3630,16 +3612,16 @@
         <w:rPr>
           <w:spacing w:val="-7"/>
           <w:w w:val="105"/>
-          <w:sz w:val="20"/>
-          <w:szCs w:val="20"/>
-        </w:rPr>
-        <w:t xml:space="preserve"> </w:t>
-      </w:r>
-      <w:r>
-        <w:rPr>
-          <w:w w:val="105"/>
-          <w:sz w:val="20"/>
-          <w:szCs w:val="20"/>
+          <w:sz w:val="19"/>
+          <w:szCs w:val="19"/>
+        </w:rPr>
+        <w:t xml:space="preserve"> </w:t>
+      </w:r>
+      <w:r>
+        <w:rPr>
+          <w:w w:val="105"/>
+          <w:sz w:val="19"/>
+          <w:szCs w:val="19"/>
         </w:rPr>
         <w:t>conformidad</w:t>
       </w:r>
@@ -3647,16 +3629,16 @@
         <w:rPr>
           <w:spacing w:val="-7"/>
           <w:w w:val="105"/>
-          <w:sz w:val="20"/>
-          <w:szCs w:val="20"/>
-        </w:rPr>
-        <w:t xml:space="preserve"> </w:t>
-      </w:r>
-      <w:r>
-        <w:rPr>
-          <w:w w:val="105"/>
-          <w:sz w:val="20"/>
-          <w:szCs w:val="20"/>
+          <w:sz w:val="19"/>
+          <w:szCs w:val="19"/>
+        </w:rPr>
+        <w:t xml:space="preserve"> </w:t>
+      </w:r>
+      <w:r>
+        <w:rPr>
+          <w:w w:val="105"/>
+          <w:sz w:val="19"/>
+          <w:szCs w:val="19"/>
         </w:rPr>
         <w:t>a</w:t>
       </w:r>
@@ -3664,16 +3646,16 @@
         <w:rPr>
           <w:spacing w:val="-8"/>
           <w:w w:val="105"/>
-          <w:sz w:val="20"/>
-          <w:szCs w:val="20"/>
-        </w:rPr>
-        <w:t xml:space="preserve"> </w:t>
-      </w:r>
-      <w:r>
-        <w:rPr>
-          <w:w w:val="105"/>
-          <w:sz w:val="20"/>
-          <w:szCs w:val="20"/>
+          <w:sz w:val="19"/>
+          <w:szCs w:val="19"/>
+        </w:rPr>
+        <w:t xml:space="preserve"> </w:t>
+      </w:r>
+      <w:r>
+        <w:rPr>
+          <w:w w:val="105"/>
+          <w:sz w:val="19"/>
+          <w:szCs w:val="19"/>
         </w:rPr>
         <w:t>los</w:t>
       </w:r>
@@ -3681,8 +3663,8 @@
         <w:rPr>
           <w:spacing w:val="-6"/>
           <w:w w:val="105"/>
-          <w:sz w:val="20"/>
-          <w:szCs w:val="20"/>
+          <w:sz w:val="19"/>
+          <w:szCs w:val="19"/>
         </w:rPr>
         <w:t xml:space="preserve"> </w:t>
       </w:r>
@@ -3690,8 +3672,8 @@
       <w:r>
         <w:rPr>
           <w:w w:val="105"/>
-          <w:sz w:val="20"/>
-          <w:szCs w:val="20"/>
+          <w:sz w:val="19"/>
+          <w:szCs w:val="19"/>
         </w:rPr>
         <w:t>TDRs</w:t>
       </w:r>
@@ -3700,16 +3682,16 @@
         <w:rPr>
           <w:spacing w:val="-6"/>
           <w:w w:val="105"/>
-          <w:sz w:val="20"/>
-          <w:szCs w:val="20"/>
-        </w:rPr>
-        <w:t xml:space="preserve"> </w:t>
-      </w:r>
-      <w:r>
-        <w:rPr>
-          <w:w w:val="105"/>
-          <w:sz w:val="20"/>
-          <w:szCs w:val="20"/>
+          <w:sz w:val="19"/>
+          <w:szCs w:val="19"/>
+        </w:rPr>
+        <w:t xml:space="preserve"> </w:t>
+      </w:r>
+      <w:r>
+        <w:rPr>
+          <w:w w:val="105"/>
+          <w:sz w:val="19"/>
+          <w:szCs w:val="19"/>
         </w:rPr>
         <w:t>del</w:t>
       </w:r>
@@ -3717,16 +3699,16 @@
         <w:rPr>
           <w:spacing w:val="-7"/>
           <w:w w:val="105"/>
-          <w:sz w:val="20"/>
-          <w:szCs w:val="20"/>
-        </w:rPr>
-        <w:t xml:space="preserve"> </w:t>
-      </w:r>
-      <w:r>
-        <w:rPr>
-          <w:w w:val="105"/>
-          <w:sz w:val="20"/>
-          <w:szCs w:val="20"/>
+          <w:sz w:val="19"/>
+          <w:szCs w:val="19"/>
+        </w:rPr>
+        <w:t xml:space="preserve"> </w:t>
+      </w:r>
+      <w:r>
+        <w:rPr>
+          <w:w w:val="105"/>
+          <w:sz w:val="19"/>
+          <w:szCs w:val="19"/>
         </w:rPr>
         <w:t>contrato</w:t>
       </w:r>
@@ -3734,16 +3716,16 @@
         <w:rPr>
           <w:spacing w:val="-8"/>
           <w:w w:val="105"/>
-          <w:sz w:val="20"/>
-          <w:szCs w:val="20"/>
-        </w:rPr>
-        <w:t xml:space="preserve"> </w:t>
-      </w:r>
-      <w:r>
-        <w:rPr>
-          <w:w w:val="105"/>
-          <w:sz w:val="20"/>
-          <w:szCs w:val="20"/>
+          <w:sz w:val="19"/>
+          <w:szCs w:val="19"/>
+        </w:rPr>
+        <w:t xml:space="preserve"> </w:t>
+      </w:r>
+      <w:r>
+        <w:rPr>
+          <w:w w:val="105"/>
+          <w:sz w:val="19"/>
+          <w:szCs w:val="19"/>
         </w:rPr>
         <w:t>suscrito</w:t>
       </w:r>
@@ -3751,16 +3733,16 @@
         <w:rPr>
           <w:spacing w:val="-8"/>
           <w:w w:val="105"/>
-          <w:sz w:val="20"/>
-          <w:szCs w:val="20"/>
-        </w:rPr>
-        <w:t xml:space="preserve"> </w:t>
-      </w:r>
-      <w:r>
-        <w:rPr>
-          <w:w w:val="105"/>
-          <w:sz w:val="20"/>
-          <w:szCs w:val="20"/>
+          <w:sz w:val="19"/>
+          <w:szCs w:val="19"/>
+        </w:rPr>
+        <w:t xml:space="preserve"> </w:t>
+      </w:r>
+      <w:r>
+        <w:rPr>
+          <w:w w:val="105"/>
+          <w:sz w:val="19"/>
+          <w:szCs w:val="19"/>
         </w:rPr>
         <w:t>con</w:t>
       </w:r>
@@ -3768,16 +3750,16 @@
         <w:rPr>
           <w:spacing w:val="-7"/>
           <w:w w:val="105"/>
-          <w:sz w:val="20"/>
-          <w:szCs w:val="20"/>
-        </w:rPr>
-        <w:t xml:space="preserve"> </w:t>
-      </w:r>
-      <w:r>
-        <w:rPr>
-          <w:w w:val="105"/>
-          <w:sz w:val="20"/>
-          <w:szCs w:val="20"/>
+          <w:sz w:val="19"/>
+          <w:szCs w:val="19"/>
+        </w:rPr>
+        <w:t xml:space="preserve"> </w:t>
+      </w:r>
+      <w:r>
+        <w:rPr>
+          <w:w w:val="105"/>
+          <w:sz w:val="19"/>
+          <w:szCs w:val="19"/>
         </w:rPr>
         <w:t>EPU</w:t>
       </w:r>
@@ -3785,16 +3767,16 @@
         <w:rPr>
           <w:spacing w:val="-7"/>
           <w:w w:val="105"/>
-          <w:sz w:val="20"/>
-          <w:szCs w:val="20"/>
-        </w:rPr>
-        <w:t xml:space="preserve"> </w:t>
-      </w:r>
-      <w:r>
-        <w:rPr>
-          <w:w w:val="105"/>
-          <w:sz w:val="20"/>
-          <w:szCs w:val="20"/>
+          <w:sz w:val="19"/>
+          <w:szCs w:val="19"/>
+        </w:rPr>
+        <w:t xml:space="preserve"> </w:t>
+      </w:r>
+      <w:r>
+        <w:rPr>
+          <w:w w:val="105"/>
+          <w:sz w:val="19"/>
+          <w:szCs w:val="19"/>
         </w:rPr>
         <w:t>e</w:t>
       </w:r>
@@ -3802,16 +3784,16 @@
         <w:rPr>
           <w:spacing w:val="-7"/>
           <w:w w:val="105"/>
-          <w:sz w:val="20"/>
-          <w:szCs w:val="20"/>
-        </w:rPr>
-        <w:t xml:space="preserve"> </w:t>
-      </w:r>
-      <w:r>
-        <w:rPr>
-          <w:w w:val="105"/>
-          <w:sz w:val="20"/>
-          <w:szCs w:val="20"/>
+          <w:sz w:val="19"/>
+          <w:szCs w:val="19"/>
+        </w:rPr>
+        <w:t xml:space="preserve"> </w:t>
+      </w:r>
+      <w:r>
+        <w:rPr>
+          <w:w w:val="105"/>
+          <w:sz w:val="19"/>
+          <w:szCs w:val="19"/>
         </w:rPr>
         <w:t>informe</w:t>
       </w:r>
@@ -3819,16 +3801,16 @@
         <w:rPr>
           <w:spacing w:val="-7"/>
           <w:w w:val="105"/>
-          <w:sz w:val="20"/>
-          <w:szCs w:val="20"/>
-        </w:rPr>
-        <w:t xml:space="preserve"> </w:t>
-      </w:r>
-      <w:r>
-        <w:rPr>
-          <w:w w:val="105"/>
-          <w:sz w:val="20"/>
-          <w:szCs w:val="20"/>
+          <w:sz w:val="19"/>
+          <w:szCs w:val="19"/>
+        </w:rPr>
+        <w:t xml:space="preserve"> </w:t>
+      </w:r>
+      <w:r>
+        <w:rPr>
+          <w:w w:val="105"/>
+          <w:sz w:val="19"/>
+          <w:szCs w:val="19"/>
         </w:rPr>
         <w:t>técnico</w:t>
       </w:r>
@@ -3836,16 +3818,16 @@
         <w:rPr>
           <w:spacing w:val="-7"/>
           <w:w w:val="105"/>
-          <w:sz w:val="20"/>
-          <w:szCs w:val="20"/>
-        </w:rPr>
-        <w:t xml:space="preserve"> </w:t>
-      </w:r>
-      <w:r>
-        <w:rPr>
-          <w:w w:val="105"/>
-          <w:sz w:val="20"/>
-          <w:szCs w:val="20"/>
+          <w:sz w:val="19"/>
+          <w:szCs w:val="19"/>
+        </w:rPr>
+        <w:t xml:space="preserve"> </w:t>
+      </w:r>
+      <w:r>
+        <w:rPr>
+          <w:w w:val="105"/>
+          <w:sz w:val="19"/>
+          <w:szCs w:val="19"/>
         </w:rPr>
         <w:t>cada</w:t>
       </w:r>
@@ -3853,16 +3835,16 @@
         <w:rPr>
           <w:spacing w:val="-8"/>
           <w:w w:val="105"/>
-          <w:sz w:val="20"/>
-          <w:szCs w:val="20"/>
-        </w:rPr>
-        <w:t xml:space="preserve"> </w:t>
-      </w:r>
-      <w:r>
-        <w:rPr>
-          <w:w w:val="105"/>
-          <w:sz w:val="20"/>
-          <w:szCs w:val="20"/>
+          <w:sz w:val="19"/>
+          <w:szCs w:val="19"/>
+        </w:rPr>
+        <w:t xml:space="preserve"> </w:t>
+      </w:r>
+      <w:r>
+        <w:rPr>
+          <w:w w:val="105"/>
+          <w:sz w:val="19"/>
+          <w:szCs w:val="19"/>
         </w:rPr>
         <w:t>quincena</w:t>
       </w:r>
@@ -3870,24 +3852,24 @@
         <w:rPr>
           <w:spacing w:val="-8"/>
           <w:w w:val="105"/>
-          <w:sz w:val="20"/>
-          <w:szCs w:val="20"/>
-        </w:rPr>
-        <w:t xml:space="preserve"> </w:t>
-      </w:r>
-      <w:r>
-        <w:rPr>
-          <w:w w:val="105"/>
-          <w:sz w:val="20"/>
-          <w:szCs w:val="20"/>
+          <w:sz w:val="19"/>
+          <w:szCs w:val="19"/>
+        </w:rPr>
+        <w:t xml:space="preserve"> </w:t>
+      </w:r>
+      <w:r>
+        <w:rPr>
+          <w:w w:val="105"/>
+          <w:sz w:val="19"/>
+          <w:szCs w:val="19"/>
         </w:rPr>
         <w:t>del mes y estratégicamente apoyar en la supervisión eficaz de los procedimientos</w:t>
       </w:r>
       <w:r>
         <w:rPr>
           <w:w w:val="105"/>
-          <w:sz w:val="20"/>
-          <w:szCs w:val="20"/>
+          <w:sz w:val="19"/>
+          <w:szCs w:val="19"/>
         </w:rPr>
         <w:t>.</w:t>
       </w:r>
@@ -3898,15 +3880,15 @@
         <w:spacing w:before="10"/>
         <w:jc w:val="both"/>
         <w:rPr>
-          <w:sz w:val="20"/>
-          <w:szCs w:val="20"/>
+          <w:sz w:val="19"/>
+          <w:szCs w:val="19"/>
         </w:rPr>
       </w:pPr>
       <w:r>
         <w:rPr>
           <w:w w:val="105"/>
-          <w:sz w:val="20"/>
-          <w:szCs w:val="20"/>
+          <w:sz w:val="19"/>
+          <w:szCs w:val="19"/>
         </w:rPr>
         <w:t>La</w:t>
       </w:r>
@@ -3914,16 +3896,16 @@
         <w:rPr>
           <w:spacing w:val="-8"/>
           <w:w w:val="105"/>
-          <w:sz w:val="20"/>
-          <w:szCs w:val="20"/>
-        </w:rPr>
-        <w:t xml:space="preserve"> </w:t>
-      </w:r>
-      <w:r>
-        <w:rPr>
-          <w:w w:val="105"/>
-          <w:sz w:val="20"/>
-          <w:szCs w:val="20"/>
+          <w:sz w:val="19"/>
+          <w:szCs w:val="19"/>
+        </w:rPr>
+        <w:t xml:space="preserve"> </w:t>
+      </w:r>
+      <w:r>
+        <w:rPr>
+          <w:w w:val="105"/>
+          <w:sz w:val="19"/>
+          <w:szCs w:val="19"/>
         </w:rPr>
         <w:t>supervisión</w:t>
       </w:r>
@@ -3931,16 +3913,16 @@
         <w:rPr>
           <w:spacing w:val="-6"/>
           <w:w w:val="105"/>
-          <w:sz w:val="20"/>
-          <w:szCs w:val="20"/>
-        </w:rPr>
-        <w:t xml:space="preserve"> </w:t>
-      </w:r>
-      <w:r>
-        <w:rPr>
-          <w:w w:val="105"/>
-          <w:sz w:val="20"/>
-          <w:szCs w:val="20"/>
+          <w:sz w:val="19"/>
+          <w:szCs w:val="19"/>
+        </w:rPr>
+        <w:t xml:space="preserve"> </w:t>
+      </w:r>
+      <w:r>
+        <w:rPr>
+          <w:w w:val="105"/>
+          <w:sz w:val="19"/>
+          <w:szCs w:val="19"/>
         </w:rPr>
         <w:t>es</w:t>
       </w:r>
@@ -3948,16 +3930,16 @@
         <w:rPr>
           <w:spacing w:val="-6"/>
           <w:w w:val="105"/>
-          <w:sz w:val="20"/>
-          <w:szCs w:val="20"/>
-        </w:rPr>
-        <w:t xml:space="preserve"> </w:t>
-      </w:r>
-      <w:r>
-        <w:rPr>
-          <w:w w:val="105"/>
-          <w:sz w:val="20"/>
-          <w:szCs w:val="20"/>
+          <w:sz w:val="19"/>
+          <w:szCs w:val="19"/>
+        </w:rPr>
+        <w:t xml:space="preserve"> </w:t>
+      </w:r>
+      <w:r>
+        <w:rPr>
+          <w:w w:val="105"/>
+          <w:sz w:val="19"/>
+          <w:szCs w:val="19"/>
         </w:rPr>
         <w:t>muestral</w:t>
       </w:r>
@@ -3965,16 +3947,16 @@
         <w:rPr>
           <w:spacing w:val="-7"/>
           <w:w w:val="105"/>
-          <w:sz w:val="20"/>
-          <w:szCs w:val="20"/>
-        </w:rPr>
-        <w:t xml:space="preserve"> </w:t>
-      </w:r>
-      <w:r>
-        <w:rPr>
-          <w:w w:val="105"/>
-          <w:sz w:val="20"/>
-          <w:szCs w:val="20"/>
+          <w:sz w:val="19"/>
+          <w:szCs w:val="19"/>
+        </w:rPr>
+        <w:t xml:space="preserve"> </w:t>
+      </w:r>
+      <w:r>
+        <w:rPr>
+          <w:w w:val="105"/>
+          <w:sz w:val="19"/>
+          <w:szCs w:val="19"/>
         </w:rPr>
         <w:t>para</w:t>
       </w:r>
@@ -3982,16 +3964,16 @@
         <w:rPr>
           <w:spacing w:val="-7"/>
           <w:w w:val="105"/>
-          <w:sz w:val="20"/>
-          <w:szCs w:val="20"/>
-        </w:rPr>
-        <w:t xml:space="preserve"> </w:t>
-      </w:r>
-      <w:r>
-        <w:rPr>
-          <w:w w:val="105"/>
-          <w:sz w:val="20"/>
-          <w:szCs w:val="20"/>
+          <w:sz w:val="19"/>
+          <w:szCs w:val="19"/>
+        </w:rPr>
+        <w:t xml:space="preserve"> </w:t>
+      </w:r>
+      <w:r>
+        <w:rPr>
+          <w:w w:val="105"/>
+          <w:sz w:val="19"/>
+          <w:szCs w:val="19"/>
         </w:rPr>
         <w:t>llegar</w:t>
       </w:r>
@@ -3999,16 +3981,16 @@
         <w:rPr>
           <w:spacing w:val="-8"/>
           <w:w w:val="105"/>
-          <w:sz w:val="20"/>
-          <w:szCs w:val="20"/>
-        </w:rPr>
-        <w:t xml:space="preserve"> </w:t>
-      </w:r>
-      <w:r>
-        <w:rPr>
-          <w:w w:val="105"/>
-          <w:sz w:val="20"/>
-          <w:szCs w:val="20"/>
+          <w:sz w:val="19"/>
+          <w:szCs w:val="19"/>
+        </w:rPr>
+        <w:t xml:space="preserve"> </w:t>
+      </w:r>
+      <w:r>
+        <w:rPr>
+          <w:w w:val="105"/>
+          <w:sz w:val="19"/>
+          <w:szCs w:val="19"/>
         </w:rPr>
         <w:t>al</w:t>
       </w:r>
@@ -4016,16 +3998,16 @@
         <w:rPr>
           <w:spacing w:val="-7"/>
           <w:w w:val="105"/>
-          <w:sz w:val="20"/>
-          <w:szCs w:val="20"/>
-        </w:rPr>
-        <w:t xml:space="preserve"> </w:t>
-      </w:r>
-      <w:r>
-        <w:rPr>
-          <w:w w:val="105"/>
-          <w:sz w:val="20"/>
-          <w:szCs w:val="20"/>
+          <w:sz w:val="19"/>
+          <w:szCs w:val="19"/>
+        </w:rPr>
+        <w:t xml:space="preserve"> </w:t>
+      </w:r>
+      <w:r>
+        <w:rPr>
+          <w:w w:val="105"/>
+          <w:sz w:val="19"/>
+          <w:szCs w:val="19"/>
         </w:rPr>
         <w:t>indicador</w:t>
       </w:r>
@@ -4033,8 +4015,8 @@
         <w:rPr>
           <w:spacing w:val="-7"/>
           <w:w w:val="105"/>
-          <w:sz w:val="20"/>
-          <w:szCs w:val="20"/>
+          <w:sz w:val="19"/>
+          <w:szCs w:val="19"/>
         </w:rPr>
         <w:t xml:space="preserve"> </w:t>
       </w:r>
@@ -4042,19 +4024,10 @@
         <w:rPr>
           <w:spacing w:val="-2"/>
           <w:w w:val="105"/>
-          <w:sz w:val="20"/>
-          <w:szCs w:val="20"/>
-        </w:rPr>
-        <w:t>mensual</w:t>
-      </w:r>
-      <w:r>
-        <w:rPr>
-          <w:spacing w:val="-2"/>
-          <w:w w:val="105"/>
-          <w:sz w:val="20"/>
-          <w:szCs w:val="20"/>
-        </w:rPr>
-        <w:t xml:space="preserve">. </w:t>
+          <w:sz w:val="19"/>
+          <w:szCs w:val="19"/>
+        </w:rPr>
+        <w:t xml:space="preserve">mensual. </w:t>
       </w:r>
     </w:p>
     <w:p>
@@ -4070,7 +4043,7 @@
     <w:tbl>
       <w:tblPr>
         <w:tblStyle w:val="TableNormal"/>
-        <w:tblW w:w="0" w:type="auto"/>
+        <w:tblW w:w="13398" w:type="dxa"/>
         <w:tblInd w:w="72" w:type="dxa"/>
         <w:tblBorders>
           <w:top w:val="single" w:sz="8" w:space="0" w:color="000000"/>
@@ -4084,17 +4057,17 @@
         <w:tblLook w:val="01E0" w:firstRow="1" w:lastRow="1" w:firstColumn="1" w:lastColumn="1" w:noHBand="0" w:noVBand="0"/>
       </w:tblPr>
       <w:tblGrid>
-        <w:gridCol w:w="3740"/>
-        <w:gridCol w:w="5082"/>
-        <w:gridCol w:w="4493"/>
+        <w:gridCol w:w="3763"/>
+        <w:gridCol w:w="5114"/>
+        <w:gridCol w:w="4521"/>
       </w:tblGrid>
       <w:tr>
         <w:trPr>
-          <w:trHeight w:val="325"/>
+          <w:trHeight w:val="500"/>
         </w:trPr>
         <w:tc>
           <w:tcPr>
-            <w:tcW w:w="3740" w:type="dxa"/>
+            <w:tcW w:w="3763" w:type="dxa"/>
             <w:shd w:val="clear" w:color="auto" w:fill="D9E0F1"/>
           </w:tcPr>
           <w:p>
@@ -4114,13 +4087,31 @@
                 <w:sz w:val="19"/>
                 <w:szCs w:val="19"/>
               </w:rPr>
-              <w:t>{{firma_coordinador}}</w:t>
+              <w:t>{{</w:t>
+            </w:r>
+            <w:proofErr w:type="spellStart"/>
+            <w:r>
+              <w:rPr>
+                <w:b/>
+                <w:sz w:val="19"/>
+                <w:szCs w:val="19"/>
+              </w:rPr>
+              <w:t>firma_coordinador</w:t>
+            </w:r>
+            <w:proofErr w:type="spellEnd"/>
+            <w:r>
+              <w:rPr>
+                <w:b/>
+                <w:sz w:val="19"/>
+                <w:szCs w:val="19"/>
+              </w:rPr>
+              <w:t>}}</w:t>
             </w:r>
           </w:p>
         </w:tc>
         <w:tc>
           <w:tcPr>
-            <w:tcW w:w="5082" w:type="dxa"/>
+            <w:tcW w:w="5114" w:type="dxa"/>
             <w:shd w:val="clear" w:color="auto" w:fill="D9E0F1"/>
           </w:tcPr>
           <w:p>
@@ -4146,7 +4137,7 @@
         </w:tc>
         <w:tc>
           <w:tcPr>
-            <w:tcW w:w="4493" w:type="dxa"/>
+            <w:tcW w:w="4521" w:type="dxa"/>
             <w:shd w:val="clear" w:color="auto" w:fill="D9E0F1"/>
           </w:tcPr>
           <w:p>
@@ -4173,11 +4164,11 @@
       </w:tr>
       <w:tr>
         <w:trPr>
-          <w:trHeight w:val="855"/>
+          <w:trHeight w:val="1315"/>
         </w:trPr>
         <w:tc>
           <w:tcPr>
-            <w:tcW w:w="3740" w:type="dxa"/>
+            <w:tcW w:w="3763" w:type="dxa"/>
           </w:tcPr>
           <w:p>
             <w:pPr>
@@ -4192,7 +4183,7 @@
         </w:tc>
         <w:tc>
           <w:tcPr>
-            <w:tcW w:w="5082" w:type="dxa"/>
+            <w:tcW w:w="5114" w:type="dxa"/>
           </w:tcPr>
           <w:p>
             <w:pPr>
@@ -4207,7 +4198,7 @@
         </w:tc>
         <w:tc>
           <w:tcPr>
-            <w:tcW w:w="4493" w:type="dxa"/>
+            <w:tcW w:w="4521" w:type="dxa"/>
           </w:tcPr>
           <w:p>
             <w:pPr>

</xml_diff>